<commit_message>
Update Word doc: split Connectors into AgenticPM tools + connected data
</commit_message>
<xml_diff>
--- a/AGENTIC-PM-one-pager.docx
+++ b/AGENTIC-PM-one-pager.docx
@@ -783,7 +783,15 @@
           <w:i w:val="0"/>
           <w:color w:val="5B6B85"/>
         </w:rPr>
-        <w:t>The paid data and systems your firm already trusts — each feeding specific skills, so the work runs on real, current data.</w:t>
+        <w:t>Two sources feed every skill — AgenticPM’s own PE-built research engines, and the paid systems your firm already trusts — so the work runs on real, current data.</w:t>
+      </w:r>
+    </w:p>
+    <w:p>
+      <w:pPr>
+        <w:pStyle w:val="Heading2"/>
+      </w:pPr>
+      <w:r>
+        <w:t>AgenticPM’s own tools — proprietary sourcing &amp; research engines, built for PE</w:t>
       </w:r>
     </w:p>
     <w:tbl>
@@ -801,7 +809,7 @@
       <w:tr>
         <w:tc>
           <w:tcPr>
-            <w:tcW w:type="dxa" w:w="2880"/>
+            <w:tcW w:type="dxa" w:w="3168"/>
             <w:shd w:val="clear" w:fill="1D4ED8"/>
           </w:tcPr>
           <w:p>
@@ -812,13 +820,13 @@
                 <w:color w:val="FFFFFF"/>
                 <w:sz w:val="21"/>
               </w:rPr>
-              <w:t>Connector</w:t>
+              <w:t>Tool</w:t>
             </w:r>
           </w:p>
         </w:tc>
         <w:tc>
           <w:tcPr>
-            <w:tcW w:type="dxa" w:w="4320"/>
+            <w:tcW w:type="dxa" w:w="4176"/>
             <w:shd w:val="clear" w:fill="1D4ED8"/>
           </w:tcPr>
           <w:p>
@@ -829,13 +837,13 @@
                 <w:color w:val="FFFFFF"/>
                 <w:sz w:val="21"/>
               </w:rPr>
-              <w:t>What it is</w:t>
+              <w:t>What it does</w:t>
             </w:r>
           </w:p>
         </w:tc>
         <w:tc>
           <w:tcPr>
-            <w:tcW w:type="dxa" w:w="2880"/>
+            <w:tcW w:type="dxa" w:w="2736"/>
             <w:shd w:val="clear" w:fill="1D4ED8"/>
           </w:tcPr>
           <w:p>
@@ -854,7 +862,350 @@
       <w:tr>
         <w:tc>
           <w:tcPr>
-            <w:tcW w:type="dxa" w:w="2880"/>
+            <w:tcW w:type="dxa" w:w="3168"/>
+          </w:tcPr>
+          <w:p>
+            <w:r/>
+            <w:r>
+              <w:rPr>
+                <w:sz w:val="21"/>
+              </w:rPr>
+              <w:t>Company Discovery</w:t>
+            </w:r>
+          </w:p>
+        </w:tc>
+        <w:tc>
+          <w:tcPr>
+            <w:tcW w:type="dxa" w:w="4176"/>
+          </w:tcPr>
+          <w:p>
+            <w:r/>
+            <w:r>
+              <w:rPr>
+                <w:sz w:val="21"/>
+              </w:rPr>
+              <w:t>surface private companies by thesis, sector, or website</w:t>
+            </w:r>
+          </w:p>
+        </w:tc>
+        <w:tc>
+          <w:tcPr>
+            <w:tcW w:type="dxa" w:w="2736"/>
+          </w:tcPr>
+          <w:p>
+            <w:r/>
+            <w:r>
+              <w:rPr>
+                <w:sz w:val="21"/>
+              </w:rPr>
+              <w:t>Market Map, Screener</w:t>
+            </w:r>
+          </w:p>
+        </w:tc>
+      </w:tr>
+      <w:tr>
+        <w:tc>
+          <w:tcPr>
+            <w:tcW w:type="dxa" w:w="3168"/>
+          </w:tcPr>
+          <w:p>
+            <w:r/>
+            <w:r>
+              <w:rPr>
+                <w:sz w:val="21"/>
+              </w:rPr>
+              <w:t>Target List Builder</w:t>
+            </w:r>
+          </w:p>
+        </w:tc>
+        <w:tc>
+          <w:tcPr>
+            <w:tcW w:type="dxa" w:w="4176"/>
+          </w:tcPr>
+          <w:p>
+            <w:r/>
+            <w:r>
+              <w:rPr>
+                <w:sz w:val="21"/>
+              </w:rPr>
+              <w:t>generate a ranked target universe from a plain-language brief</w:t>
+            </w:r>
+          </w:p>
+        </w:tc>
+        <w:tc>
+          <w:tcPr>
+            <w:tcW w:type="dxa" w:w="2736"/>
+          </w:tcPr>
+          <w:p>
+            <w:r/>
+            <w:r>
+              <w:rPr>
+                <w:sz w:val="21"/>
+              </w:rPr>
+              <w:t>Market Map, Bolt-On Finder</w:t>
+            </w:r>
+          </w:p>
+        </w:tc>
+      </w:tr>
+      <w:tr>
+        <w:tc>
+          <w:tcPr>
+            <w:tcW w:type="dxa" w:w="3168"/>
+          </w:tcPr>
+          <w:p>
+            <w:r/>
+            <w:r>
+              <w:rPr>
+                <w:sz w:val="21"/>
+              </w:rPr>
+              <w:t>Company Intelligence</w:t>
+            </w:r>
+          </w:p>
+        </w:tc>
+        <w:tc>
+          <w:tcPr>
+            <w:tcW w:type="dxa" w:w="4176"/>
+          </w:tcPr>
+          <w:p>
+            <w:r/>
+            <w:r>
+              <w:rPr>
+                <w:sz w:val="21"/>
+              </w:rPr>
+              <w:t>structured financial &amp; firmographic profile for any company</w:t>
+            </w:r>
+          </w:p>
+        </w:tc>
+        <w:tc>
+          <w:tcPr>
+            <w:tcW w:type="dxa" w:w="2736"/>
+          </w:tcPr>
+          <w:p>
+            <w:r/>
+            <w:r>
+              <w:rPr>
+                <w:sz w:val="21"/>
+              </w:rPr>
+              <w:t>Screener, One-Pager</w:t>
+            </w:r>
+          </w:p>
+        </w:tc>
+      </w:tr>
+      <w:tr>
+        <w:tc>
+          <w:tcPr>
+            <w:tcW w:type="dxa" w:w="3168"/>
+          </w:tcPr>
+          <w:p>
+            <w:r/>
+            <w:r>
+              <w:rPr>
+                <w:sz w:val="21"/>
+              </w:rPr>
+              <w:t>M&amp;A / Deal Search</w:t>
+            </w:r>
+          </w:p>
+        </w:tc>
+        <w:tc>
+          <w:tcPr>
+            <w:tcW w:type="dxa" w:w="4176"/>
+          </w:tcPr>
+          <w:p>
+            <w:r/>
+            <w:r>
+              <w:rPr>
+                <w:sz w:val="21"/>
+              </w:rPr>
+              <w:t>precedent transactions, acquirers &amp; active investors</w:t>
+            </w:r>
+          </w:p>
+        </w:tc>
+        <w:tc>
+          <w:tcPr>
+            <w:tcW w:type="dxa" w:w="2736"/>
+          </w:tcPr>
+          <w:p>
+            <w:r/>
+            <w:r>
+              <w:rPr>
+                <w:sz w:val="21"/>
+              </w:rPr>
+              <w:t>Comps &amp; Precedents</w:t>
+            </w:r>
+          </w:p>
+        </w:tc>
+      </w:tr>
+      <w:tr>
+        <w:tc>
+          <w:tcPr>
+            <w:tcW w:type="dxa" w:w="3168"/>
+          </w:tcPr>
+          <w:p>
+            <w:r/>
+            <w:r>
+              <w:rPr>
+                <w:sz w:val="21"/>
+              </w:rPr>
+              <w:t>People &amp; Leadership Finder</w:t>
+            </w:r>
+          </w:p>
+        </w:tc>
+        <w:tc>
+          <w:tcPr>
+            <w:tcW w:type="dxa" w:w="4176"/>
+          </w:tcPr>
+          <w:p>
+            <w:r/>
+            <w:r>
+              <w:rPr>
+                <w:sz w:val="21"/>
+              </w:rPr>
+              <w:t>decision-makers, CEOs &amp; verified contacts</w:t>
+            </w:r>
+          </w:p>
+        </w:tc>
+        <w:tc>
+          <w:tcPr>
+            <w:tcW w:type="dxa" w:w="2736"/>
+          </w:tcPr>
+          <w:p>
+            <w:r/>
+            <w:r>
+              <w:rPr>
+                <w:sz w:val="21"/>
+              </w:rPr>
+              <w:t>Warm-Path, Management Call Prep</w:t>
+            </w:r>
+          </w:p>
+        </w:tc>
+      </w:tr>
+      <w:tr>
+        <w:tc>
+          <w:tcPr>
+            <w:tcW w:type="dxa" w:w="3168"/>
+          </w:tcPr>
+          <w:p>
+            <w:r/>
+            <w:r>
+              <w:rPr>
+                <w:sz w:val="21"/>
+              </w:rPr>
+              <w:t>News &amp; Signal Search</w:t>
+            </w:r>
+          </w:p>
+        </w:tc>
+        <w:tc>
+          <w:tcPr>
+            <w:tcW w:type="dxa" w:w="4176"/>
+          </w:tcPr>
+          <w:p>
+            <w:r/>
+            <w:r>
+              <w:rPr>
+                <w:sz w:val="21"/>
+              </w:rPr>
+              <w:t>vetted news &amp; market signals on a target</w:t>
+            </w:r>
+          </w:p>
+        </w:tc>
+        <w:tc>
+          <w:tcPr>
+            <w:tcW w:type="dxa" w:w="2736"/>
+          </w:tcPr>
+          <w:p>
+            <w:r/>
+            <w:r>
+              <w:rPr>
+                <w:sz w:val="21"/>
+              </w:rPr>
+              <w:t>Red-Flag Scan, KPI Monitoring</w:t>
+            </w:r>
+          </w:p>
+        </w:tc>
+      </w:tr>
+    </w:tbl>
+    <w:p>
+      <w:pPr>
+        <w:spacing w:after="40"/>
+      </w:pPr>
+    </w:p>
+    <w:p>
+      <w:pPr>
+        <w:pStyle w:val="Heading2"/>
+      </w:pPr>
+      <w:r>
+        <w:t>Your firm’s connected data — the paid systems you already trust</w:t>
+      </w:r>
+    </w:p>
+    <w:tbl>
+      <w:tblPr>
+        <w:tblStyle w:val="TableGrid"/>
+        <w:tblW w:type="auto" w:w="0"/>
+        <w:jc w:val="left"/>
+        <w:tblLook w:firstColumn="1" w:firstRow="1" w:lastColumn="0" w:lastRow="0" w:noHBand="0" w:noVBand="1" w:val="04A0"/>
+      </w:tblPr>
+      <w:tblGrid>
+        <w:gridCol w:w="2880"/>
+        <w:gridCol w:w="2880"/>
+        <w:gridCol w:w="2880"/>
+      </w:tblGrid>
+      <w:tr>
+        <w:tc>
+          <w:tcPr>
+            <w:tcW w:type="dxa" w:w="3168"/>
+            <w:shd w:val="clear" w:fill="1D4ED8"/>
+          </w:tcPr>
+          <w:p>
+            <w:r/>
+            <w:r>
+              <w:rPr>
+                <w:b/>
+                <w:color w:val="FFFFFF"/>
+                <w:sz w:val="21"/>
+              </w:rPr>
+              <w:t>System</w:t>
+            </w:r>
+          </w:p>
+        </w:tc>
+        <w:tc>
+          <w:tcPr>
+            <w:tcW w:type="dxa" w:w="4176"/>
+            <w:shd w:val="clear" w:fill="1D4ED8"/>
+          </w:tcPr>
+          <w:p>
+            <w:r/>
+            <w:r>
+              <w:rPr>
+                <w:b/>
+                <w:color w:val="FFFFFF"/>
+                <w:sz w:val="21"/>
+              </w:rPr>
+              <w:t>What it is</w:t>
+            </w:r>
+          </w:p>
+        </w:tc>
+        <w:tc>
+          <w:tcPr>
+            <w:tcW w:type="dxa" w:w="2736"/>
+            <w:shd w:val="clear" w:fill="1D4ED8"/>
+          </w:tcPr>
+          <w:p>
+            <w:r/>
+            <w:r>
+              <w:rPr>
+                <w:b/>
+                <w:color w:val="FFFFFF"/>
+                <w:sz w:val="21"/>
+              </w:rPr>
+              <w:t>Feeds</w:t>
+            </w:r>
+          </w:p>
+        </w:tc>
+      </w:tr>
+      <w:tr>
+        <w:tc>
+          <w:tcPr>
+            <w:tcW w:type="dxa" w:w="3168"/>
           </w:tcPr>
           <w:p>
             <w:r/>
@@ -868,7 +1219,7 @@
         </w:tc>
         <w:tc>
           <w:tcPr>
-            <w:tcW w:type="dxa" w:w="4320"/>
+            <w:tcW w:type="dxa" w:w="4176"/>
           </w:tcPr>
           <w:p>
             <w:r/>
@@ -882,7 +1233,7 @@
         </w:tc>
         <w:tc>
           <w:tcPr>
-            <w:tcW w:type="dxa" w:w="2880"/>
+            <w:tcW w:type="dxa" w:w="2736"/>
           </w:tcPr>
           <w:p>
             <w:r/>
@@ -898,7 +1249,7 @@
       <w:tr>
         <w:tc>
           <w:tcPr>
-            <w:tcW w:type="dxa" w:w="2880"/>
+            <w:tcW w:type="dxa" w:w="3168"/>
           </w:tcPr>
           <w:p>
             <w:r/>
@@ -912,7 +1263,7 @@
         </w:tc>
         <w:tc>
           <w:tcPr>
-            <w:tcW w:type="dxa" w:w="4320"/>
+            <w:tcW w:type="dxa" w:w="4176"/>
           </w:tcPr>
           <w:p>
             <w:r/>
@@ -926,7 +1277,7 @@
         </w:tc>
         <w:tc>
           <w:tcPr>
-            <w:tcW w:type="dxa" w:w="2880"/>
+            <w:tcW w:type="dxa" w:w="2736"/>
           </w:tcPr>
           <w:p>
             <w:r/>
@@ -942,7 +1293,7 @@
       <w:tr>
         <w:tc>
           <w:tcPr>
-            <w:tcW w:type="dxa" w:w="2880"/>
+            <w:tcW w:type="dxa" w:w="3168"/>
           </w:tcPr>
           <w:p>
             <w:r/>
@@ -956,7 +1307,7 @@
         </w:tc>
         <w:tc>
           <w:tcPr>
-            <w:tcW w:type="dxa" w:w="4320"/>
+            <w:tcW w:type="dxa" w:w="4176"/>
           </w:tcPr>
           <w:p>
             <w:r/>
@@ -970,7 +1321,7 @@
         </w:tc>
         <w:tc>
           <w:tcPr>
-            <w:tcW w:type="dxa" w:w="2880"/>
+            <w:tcW w:type="dxa" w:w="2736"/>
           </w:tcPr>
           <w:p>
             <w:r/>
@@ -986,7 +1337,7 @@
       <w:tr>
         <w:tc>
           <w:tcPr>
-            <w:tcW w:type="dxa" w:w="2880"/>
+            <w:tcW w:type="dxa" w:w="3168"/>
           </w:tcPr>
           <w:p>
             <w:r/>
@@ -1000,7 +1351,7 @@
         </w:tc>
         <w:tc>
           <w:tcPr>
-            <w:tcW w:type="dxa" w:w="4320"/>
+            <w:tcW w:type="dxa" w:w="4176"/>
           </w:tcPr>
           <w:p>
             <w:r/>
@@ -1014,7 +1365,7 @@
         </w:tc>
         <w:tc>
           <w:tcPr>
-            <w:tcW w:type="dxa" w:w="2880"/>
+            <w:tcW w:type="dxa" w:w="2736"/>
           </w:tcPr>
           <w:p>
             <w:r/>
@@ -1030,7 +1381,7 @@
       <w:tr>
         <w:tc>
           <w:tcPr>
-            <w:tcW w:type="dxa" w:w="2880"/>
+            <w:tcW w:type="dxa" w:w="3168"/>
           </w:tcPr>
           <w:p>
             <w:r/>
@@ -1038,13 +1389,13 @@
               <w:rPr>
                 <w:sz w:val="21"/>
               </w:rPr>
-              <w:t>DataHub</w:t>
+              <w:t>Salesforce / HubSpot</w:t>
             </w:r>
           </w:p>
         </w:tc>
         <w:tc>
           <w:tcPr>
-            <w:tcW w:type="dxa" w:w="4320"/>
+            <w:tcW w:type="dxa" w:w="4176"/>
           </w:tcPr>
           <w:p>
             <w:r/>
@@ -1052,13 +1403,13 @@
               <w:rPr>
                 <w:sz w:val="21"/>
               </w:rPr>
-              <w:t>the firm’s data catalog</w:t>
+              <w:t>accounts, pipeline &amp; relationship history</w:t>
             </w:r>
           </w:p>
         </w:tc>
         <w:tc>
           <w:tcPr>
-            <w:tcW w:type="dxa" w:w="2880"/>
+            <w:tcW w:type="dxa" w:w="2736"/>
           </w:tcPr>
           <w:p>
             <w:r/>
@@ -1066,7 +1417,7 @@
               <w:rPr>
                 <w:sz w:val="21"/>
               </w:rPr>
-              <w:t>Portfolio KPIs, Data-Room Structure</w:t>
+              <w:t>Pipeline, Warm-Path, CRM sync</w:t>
             </w:r>
           </w:p>
         </w:tc>
@@ -1074,51 +1425,7 @@
       <w:tr>
         <w:tc>
           <w:tcPr>
-            <w:tcW w:type="dxa" w:w="2880"/>
-          </w:tcPr>
-          <w:p>
-            <w:r/>
-            <w:r>
-              <w:rPr>
-                <w:sz w:val="21"/>
-              </w:rPr>
-              <w:t>HubSpot</w:t>
-            </w:r>
-          </w:p>
-        </w:tc>
-        <w:tc>
-          <w:tcPr>
-            <w:tcW w:type="dxa" w:w="4320"/>
-          </w:tcPr>
-          <w:p>
-            <w:r/>
-            <w:r>
-              <w:rPr>
-                <w:sz w:val="21"/>
-              </w:rPr>
-              <w:t>deal pipeline &amp; relationship history</w:t>
-            </w:r>
-          </w:p>
-        </w:tc>
-        <w:tc>
-          <w:tcPr>
-            <w:tcW w:type="dxa" w:w="2880"/>
-          </w:tcPr>
-          <w:p>
-            <w:r/>
-            <w:r>
-              <w:rPr>
-                <w:sz w:val="21"/>
-              </w:rPr>
-              <w:t>Pipeline, CRM Skills</w:t>
-            </w:r>
-          </w:p>
-        </w:tc>
-      </w:tr>
-      <w:tr>
-        <w:tc>
-          <w:tcPr>
-            <w:tcW w:type="dxa" w:w="2880"/>
+            <w:tcW w:type="dxa" w:w="3168"/>
           </w:tcPr>
           <w:p>
             <w:r/>
@@ -1132,7 +1439,7 @@
         </w:tc>
         <w:tc>
           <w:tcPr>
-            <w:tcW w:type="dxa" w:w="4320"/>
+            <w:tcW w:type="dxa" w:w="4176"/>
           </w:tcPr>
           <w:p>
             <w:r/>
@@ -1146,7 +1453,7 @@
         </w:tc>
         <w:tc>
           <w:tcPr>
-            <w:tcW w:type="dxa" w:w="2880"/>
+            <w:tcW w:type="dxa" w:w="2736"/>
           </w:tcPr>
           <w:p>
             <w:r/>

</xml_diff>

<commit_message>
Update one-pager Word doc: trimmed task counts, two-group connectors, per-section demo Q&A + outputs
Co-Authored-By: Claude Opus 4.8 <noreply@anthropic.com>
Claude-Session: https://claude.ai/code/session_011YSka9wdq7KrBYzbQXMRhD
</commit_message>
<xml_diff>
--- a/AGENTIC-PM-one-pager.docx
+++ b/AGENTIC-PM-one-pager.docx
@@ -15,7 +15,7 @@
         <w:pStyle w:val="Subtitle"/>
       </w:pPr>
       <w:r>
-        <w:t>PE Decision Intelligence — on Claude</w:t>
+        <w:t>PE Decision Intelligence — the interactive one-pager (full content)</w:t>
       </w:r>
     </w:p>
     <w:p>
@@ -30,6 +30,7 @@
     <w:p>
       <w:r>
         <w:rPr>
+          <w:b w:val="0"/>
           <w:i w:val="0"/>
           <w:color w:val="5B6B85"/>
         </w:rPr>
@@ -37,11 +38,31 @@
       </w:r>
     </w:p>
     <w:p>
+      <w:r>
+        <w:rPr>
+          <w:b w:val="0"/>
+          <w:i w:val="0"/>
+          <w:color w:val="5B6B85"/>
+        </w:rPr>
+        <w:t>Primary call to action: Reach out to book a demo.</w:t>
+      </w:r>
+    </w:p>
+    <w:p>
+      <w:r>
+        <w:rPr>
+          <w:b w:val="0"/>
+          <w:i w:val="0"/>
+          <w:color w:val="5B6B85"/>
+        </w:rPr>
+        <w:t>Note: each of the five sections highlights one task (★) and plays a live Claude demo — user question → answer → rendered output. A running deal, “Project Atlas” (founder-owned vertical-SaaS / logistics), threads through the demos.</w:t>
+      </w:r>
+    </w:p>
+    <w:p>
       <w:pPr>
         <w:pBdr>
           <w:bottom w:val="single" w:sz="6" w:space="1" w:color="D5E2FF"/>
         </w:pBdr>
-        <w:spacing w:before="40" w:after="160"/>
+        <w:spacing w:before="80" w:after="160"/>
       </w:pPr>
     </w:p>
     <w:p>
@@ -64,6 +85,7 @@
     <w:p>
       <w:r>
         <w:rPr>
+          <w:b w:val="0"/>
           <w:i w:val="0"/>
           <w:color w:val="5B6B85"/>
         </w:rPr>
@@ -250,7 +272,7 @@
         <w:pBdr>
           <w:bottom w:val="single" w:sz="6" w:space="1" w:color="D5E2FF"/>
         </w:pBdr>
-        <w:spacing w:before="40" w:after="160"/>
+        <w:spacing w:before="80" w:after="160"/>
       </w:pPr>
     </w:p>
     <w:p>
@@ -273,18 +295,11 @@
     <w:p>
       <w:r>
         <w:rPr>
+          <w:b w:val="0"/>
           <w:i w:val="0"/>
           <w:color w:val="5B6B85"/>
         </w:rPr>
         <w:t>Five pieces that fit together — turning a question into an IC-ready deliverable that reasons like your firm. Connectors and Knowledge make it yours; Skills do the work; Components and Templates ship it.</w:t>
-      </w:r>
-    </w:p>
-    <w:p>
-      <w:pPr>
-        <w:pStyle w:val="Heading2"/>
-      </w:pPr>
-      <w:r>
-        <w:t>Inputs — make it yours</w:t>
       </w:r>
     </w:p>
     <w:p>
@@ -295,13 +310,13 @@
         <w:rPr>
           <w:b/>
         </w:rPr>
-        <w:t>Connectors</w:t>
+        <w:t>Inputs — Connectors</w:t>
       </w:r>
       <w:r>
         <w:rPr>
           <w:color w:val="5B6B85"/>
         </w:rPr>
-        <w:t xml:space="preserve"> — feed live data</w:t>
+        <w:t xml:space="preserve"> (feed live data) · Knowledge (thinks like your firm)</w:t>
       </w:r>
     </w:p>
     <w:p>
@@ -312,21 +327,13 @@
         <w:rPr>
           <w:b/>
         </w:rPr>
-        <w:t>Knowledge</w:t>
+        <w:t>Engine — Skills</w:t>
       </w:r>
       <w:r>
         <w:rPr>
           <w:color w:val="5B6B85"/>
         </w:rPr>
-        <w:t xml:space="preserve"> — thinks like your firm</w:t>
-      </w:r>
-    </w:p>
-    <w:p>
-      <w:pPr>
-        <w:pStyle w:val="Heading2"/>
-      </w:pPr>
-      <w:r>
-        <w:t>The engine</w:t>
+        <w:t xml:space="preserve"> (do the work)</w:t>
       </w:r>
     </w:p>
     <w:p>
@@ -337,55 +344,13 @@
         <w:rPr>
           <w:b/>
         </w:rPr>
-        <w:t>Skills</w:t>
+        <w:t>Delivery — Components</w:t>
       </w:r>
       <w:r>
         <w:rPr>
           <w:color w:val="5B6B85"/>
         </w:rPr>
-        <w:t xml:space="preserve"> — do the work</w:t>
-      </w:r>
-    </w:p>
-    <w:p>
-      <w:pPr>
-        <w:pStyle w:val="Heading2"/>
-      </w:pPr>
-      <w:r>
-        <w:t>Delivery — make it usable</w:t>
-      </w:r>
-    </w:p>
-    <w:p>
-      <w:pPr>
-        <w:pStyle w:val="ListBullet"/>
-      </w:pPr>
-      <w:r>
-        <w:rPr>
-          <w:b/>
-        </w:rPr>
-        <w:t>Components</w:t>
-      </w:r>
-      <w:r>
-        <w:rPr>
-          <w:color w:val="5B6B85"/>
-        </w:rPr>
-        <w:t xml:space="preserve"> — render the answer</w:t>
-      </w:r>
-    </w:p>
-    <w:p>
-      <w:pPr>
-        <w:pStyle w:val="ListBullet"/>
-      </w:pPr>
-      <w:r>
-        <w:rPr>
-          <w:b/>
-        </w:rPr>
-        <w:t>Templates</w:t>
-      </w:r>
-      <w:r>
-        <w:rPr>
-          <w:color w:val="5B6B85"/>
-        </w:rPr>
-        <w:t xml:space="preserve"> — ship the deliverable</w:t>
+        <w:t xml:space="preserve"> (render the answer) · Templates (ship the deliverable)</w:t>
       </w:r>
     </w:p>
     <w:p>
@@ -393,7 +358,7 @@
         <w:pBdr>
           <w:bottom w:val="single" w:sz="6" w:space="1" w:color="D5E2FF"/>
         </w:pBdr>
-        <w:spacing w:before="40" w:after="160"/>
+        <w:spacing w:before="80" w:after="160"/>
       </w:pPr>
     </w:p>
     <w:p>
@@ -416,6 +381,7 @@
     <w:p>
       <w:r>
         <w:rPr>
+          <w:b w:val="0"/>
           <w:i w:val="0"/>
           <w:color w:val="5B6B85"/>
         </w:rPr>
@@ -427,7 +393,7 @@
         <w:pStyle w:val="Heading2"/>
       </w:pPr>
       <w:r>
-        <w:t>Sourcing — find &amp; qualify the deals worth pursuing</w:t>
+        <w:t>Sourcing</w:t>
       </w:r>
     </w:p>
     <w:p>
@@ -480,39 +446,13 @@
         </w:rPr>
         <w:t>— turn raw data into a teaser-ready profile</w:t>
       </w:r>
-    </w:p>
-    <w:p>
-      <w:pPr>
-        <w:pStyle w:val="ListBullet"/>
-      </w:pPr>
       <w:r>
         <w:rPr>
           <w:b/>
+          <w:color w:val="1D4ED8"/>
+          <w:sz w:val="16"/>
         </w:rPr>
-        <w:t>Warm-Path Finder</w:t>
-      </w:r>
-      <w:r>
-        <w:rPr>
-          <w:color w:val="5B6B85"/>
-        </w:rPr>
-        <w:t>— map relationship routes into a target</w:t>
-      </w:r>
-    </w:p>
-    <w:p>
-      <w:pPr>
-        <w:pStyle w:val="ListBullet"/>
-      </w:pPr>
-      <w:r>
-        <w:rPr>
-          <w:b/>
-        </w:rPr>
-        <w:t>Pipeline Updater</w:t>
-      </w:r>
-      <w:r>
-        <w:rPr>
-          <w:color w:val="5B6B85"/>
-        </w:rPr>
-        <w:t>— refresh CRM stages, flag stalled deals</w:t>
+        <w:t xml:space="preserve">   ★ live demo</w:t>
       </w:r>
     </w:p>
     <w:p>
@@ -520,7 +460,7 @@
         <w:pStyle w:val="Heading2"/>
       </w:pPr>
       <w:r>
-        <w:t>Diligence — pressure-test the thesis to an IC decision</w:t>
+        <w:t>Diligence</w:t>
       </w:r>
     </w:p>
     <w:p>
@@ -548,81 +488,13 @@
         <w:rPr>
           <w:b/>
         </w:rPr>
-        <w:t>CIM &amp; Data-Room Summarizer</w:t>
-      </w:r>
-      <w:r>
-        <w:rPr>
-          <w:color w:val="5B6B85"/>
-        </w:rPr>
-        <w:t>— digest a deck or data room into key findings</w:t>
-      </w:r>
-    </w:p>
-    <w:p>
-      <w:pPr>
-        <w:pStyle w:val="ListBullet"/>
-      </w:pPr>
-      <w:r>
-        <w:rPr>
-          <w:b/>
-        </w:rPr>
         <w:t>Comps &amp; Precedents Builder</w:t>
       </w:r>
       <w:r>
         <w:rPr>
           <w:color w:val="5B6B85"/>
         </w:rPr>
-        <w:t>— pull comparable companies and prior deals</w:t>
-      </w:r>
-    </w:p>
-    <w:p>
-      <w:pPr>
-        <w:pStyle w:val="ListBullet"/>
-      </w:pPr>
-      <w:r>
-        <w:rPr>
-          <w:b/>
-        </w:rPr>
-        <w:t>QoE First Pass</w:t>
-      </w:r>
-      <w:r>
-        <w:rPr>
-          <w:color w:val="5B6B85"/>
-        </w:rPr>
-        <w:t>— flag quality-of-earnings issues early</w:t>
-      </w:r>
-    </w:p>
-    <w:p>
-      <w:pPr>
-        <w:pStyle w:val="ListBullet"/>
-      </w:pPr>
-      <w:r>
-        <w:rPr>
-          <w:b/>
-        </w:rPr>
-        <w:t>Red-Flag Scan</w:t>
-      </w:r>
-      <w:r>
-        <w:rPr>
-          <w:color w:val="5B6B85"/>
-        </w:rPr>
-        <w:t>— run the target against your risk checklist</w:t>
-      </w:r>
-    </w:p>
-    <w:p>
-      <w:pPr>
-        <w:pStyle w:val="ListBullet"/>
-      </w:pPr>
-      <w:r>
-        <w:rPr>
-          <w:b/>
-        </w:rPr>
-        <w:t>Management Call Prep</w:t>
-      </w:r>
-      <w:r>
-        <w:rPr>
-          <w:color w:val="5B6B85"/>
-        </w:rPr>
-        <w:t>— generate the question list and briefing pack</w:t>
+        <w:t>— pull comparable companies &amp; prior deals</w:t>
       </w:r>
     </w:p>
     <w:p>
@@ -647,7 +519,7 @@
         <w:pStyle w:val="Heading2"/>
       </w:pPr>
       <w:r>
-        <w:t>Portfolio — drive value from close to exit</w:t>
+        <w:t>Portfolio</w:t>
       </w:r>
     </w:p>
     <w:p>
@@ -692,57 +564,6 @@
         <w:rPr>
           <w:b/>
         </w:rPr>
-        <w:t>Bolt-On Finder</w:t>
-      </w:r>
-      <w:r>
-        <w:rPr>
-          <w:color w:val="5B6B85"/>
-        </w:rPr>
-        <w:t>— source add-on acquisition targets for a portco</w:t>
-      </w:r>
-    </w:p>
-    <w:p>
-      <w:pPr>
-        <w:pStyle w:val="ListBullet"/>
-      </w:pPr>
-      <w:r>
-        <w:rPr>
-          <w:b/>
-        </w:rPr>
-        <w:t>Board Deck Generator</w:t>
-      </w:r>
-      <w:r>
-        <w:rPr>
-          <w:color w:val="5B6B85"/>
-        </w:rPr>
-        <w:t>— assemble the quarterly board pack</w:t>
-      </w:r>
-    </w:p>
-    <w:p>
-      <w:pPr>
-        <w:pStyle w:val="ListBullet"/>
-      </w:pPr>
-      <w:r>
-        <w:rPr>
-          <w:b/>
-        </w:rPr>
-        <w:t>Portfolio Benchmarking</w:t>
-      </w:r>
-      <w:r>
-        <w:rPr>
-          <w:color w:val="5B6B85"/>
-        </w:rPr>
-        <w:t>— compare portcos against each other &amp; peers</w:t>
-      </w:r>
-    </w:p>
-    <w:p>
-      <w:pPr>
-        <w:pStyle w:val="ListBullet"/>
-      </w:pPr>
-      <w:r>
-        <w:rPr>
-          <w:b/>
-        </w:rPr>
         <w:t>Exit Readiness Assessment</w:t>
       </w:r>
       <w:r>
@@ -754,10 +575,154 @@
     </w:p>
     <w:p>
       <w:pPr>
+        <w:spacing w:before="180" w:after="20"/>
+      </w:pPr>
+      <w:r>
+        <w:rPr>
+          <w:b/>
+          <w:color w:val="1D4ED8"/>
+          <w:sz w:val="18"/>
+        </w:rPr>
+        <w:t>LIVE DEMO — HIGHLIGHTED: COMPANY ONE-PAGER</w:t>
+      </w:r>
+    </w:p>
+    <w:p>
+      <w:r>
+        <w:rPr>
+          <w:b/>
+          <w:i w:val="0"/>
+        </w:rPr>
+        <w:t>User asks:</w:t>
+      </w:r>
+    </w:p>
+    <w:p>
+      <w:pPr>
+        <w:pBdr>
+          <w:left w:val="single" w:sz="18" w:space="8" w:color="1D4ED8"/>
+        </w:pBdr>
+        <w:spacing w:after="100"/>
+        <w:ind w:left="200"/>
+      </w:pPr>
+      <w:r>
+        <w:rPr>
+          <w:i/>
+          <w:sz w:val="24"/>
+        </w:rPr>
+        <w:t>“Build a one-pager on Project Atlas — the founder-owned logistics-software target we’re screening.”</w:t>
+      </w:r>
+    </w:p>
+    <w:p>
+      <w:r>
+        <w:rPr>
+          <w:b/>
+          <w:i w:val="0"/>
+        </w:rPr>
+        <w:t>Claude responds:</w:t>
+      </w:r>
+    </w:p>
+    <w:p>
+      <w:r>
+        <w:rPr>
+          <w:b w:val="0"/>
+          <w:i w:val="0"/>
+          <w:color w:val="5B6B85"/>
+        </w:rPr>
+        <w:t>Pulling Project Atlas from Company Intelligence and cross-checking revenue and headcount against PitchBook and your CRM…</w:t>
+      </w:r>
+    </w:p>
+    <w:p>
+      <w:r>
+        <w:rPr>
+          <w:b w:val="0"/>
+          <w:i w:val="0"/>
+          <w:color w:val="5B6B85"/>
+        </w:rPr>
+        <w:t>Done. Structured a teaser-ready profile around the metrics your IC looks at first — with the customer-concentration flag surfaced up front.</w:t>
+      </w:r>
+    </w:p>
+    <w:p>
+      <w:r>
+        <w:rPr>
+          <w:b/>
+          <w:i w:val="0"/>
+        </w:rPr>
+        <w:t>Output shown:</w:t>
+      </w:r>
+    </w:p>
+    <w:p>
+      <w:pPr>
+        <w:pStyle w:val="ListBullet"/>
+      </w:pPr>
+      <w:r>
+        <w:rPr>
+          <w:b/>
+        </w:rPr>
+        <w:t xml:space="preserve">Company One-Pager — Project Atlas: </w:t>
+      </w:r>
+      <w:r>
+        <w:rPr>
+          <w:color w:val="5B6B85"/>
+        </w:rPr>
+        <w:t>Freight &amp; logistics OS · Amsterdam · founder-owned · Thesis fit: Strong</w:t>
+      </w:r>
+    </w:p>
+    <w:p>
+      <w:pPr>
+        <w:pStyle w:val="ListBullet"/>
+      </w:pPr>
+      <w:r>
+        <w:rPr>
+          <w:b/>
+        </w:rPr>
+        <w:t xml:space="preserve">Key metrics: </w:t>
+      </w:r>
+      <w:r>
+        <w:rPr>
+          <w:color w:val="5B6B85"/>
+        </w:rPr>
+        <w:t>ARR €14M · YoY growth +38% · Net retention 118% · Customers 90+</w:t>
+      </w:r>
+    </w:p>
+    <w:p>
+      <w:pPr>
+        <w:pStyle w:val="ListBullet"/>
+      </w:pPr>
+      <w:r>
+        <w:rPr>
+          <w:b/>
+        </w:rPr>
+        <w:t xml:space="preserve">Description: </w:t>
+      </w:r>
+      <w:r>
+        <w:rPr>
+          <w:color w:val="5B6B85"/>
+        </w:rPr>
+        <w:t>Cloud platform for mid-market freight forwarders — quoting, booking &amp; track-and-trace in one system. Top-3 customers = 41% of revenue.</w:t>
+      </w:r>
+    </w:p>
+    <w:p>
+      <w:pPr>
+        <w:pStyle w:val="ListBullet"/>
+      </w:pPr>
+      <w:r>
+        <w:rPr>
+          <w:b/>
+        </w:rPr>
+        <w:t xml:space="preserve">Sources: </w:t>
+      </w:r>
+      <w:r>
+        <w:rPr>
+          <w:color w:val="5B6B85"/>
+        </w:rPr>
+        <w:t>Company Intelligence · PitchBook · CRM</w:t>
+      </w:r>
+    </w:p>
+    <w:p>
+      <w:pPr>
         <w:pBdr>
           <w:bottom w:val="single" w:sz="6" w:space="1" w:color="D5E2FF"/>
         </w:pBdr>
-        <w:spacing w:before="40" w:after="160"/>
+        <w:spacing w:before="80" w:after="160"/>
       </w:pPr>
     </w:p>
     <w:p>
@@ -780,10 +745,11 @@
     <w:p>
       <w:r>
         <w:rPr>
+          <w:b w:val="0"/>
           <w:i w:val="0"/>
           <w:color w:val="5B6B85"/>
         </w:rPr>
-        <w:t>Two sources feed every skill — AgenticPM’s own PE-built research engines, and the paid systems your firm already trusts — so the work runs on real, current data.</w:t>
+        <w:t>Two sources feed every skill — AgenticPM’s own PE-built research engines, and the paid systems your firm already trusts.</w:t>
       </w:r>
     </w:p>
     <w:p>
@@ -791,693 +757,270 @@
         <w:pStyle w:val="Heading2"/>
       </w:pPr>
       <w:r>
-        <w:t>AgenticPM’s own tools — proprietary sourcing &amp; research engines, built for PE</w:t>
+        <w:t>AgenticPM’s own tools</w:t>
       </w:r>
     </w:p>
-    <w:tbl>
-      <w:tblPr>
-        <w:tblStyle w:val="TableGrid"/>
-        <w:tblW w:type="auto" w:w="0"/>
-        <w:jc w:val="left"/>
-        <w:tblLook w:firstColumn="1" w:firstRow="1" w:lastColumn="0" w:lastRow="0" w:noHBand="0" w:noVBand="1" w:val="04A0"/>
-      </w:tblPr>
-      <w:tblGrid>
-        <w:gridCol w:w="2880"/>
-        <w:gridCol w:w="2880"/>
-        <w:gridCol w:w="2880"/>
-      </w:tblGrid>
-      <w:tr>
-        <w:tc>
-          <w:tcPr>
-            <w:tcW w:type="dxa" w:w="3168"/>
-            <w:shd w:val="clear" w:fill="1D4ED8"/>
-          </w:tcPr>
-          <w:p>
-            <w:r/>
-            <w:r>
-              <w:rPr>
-                <w:b/>
-                <w:color w:val="FFFFFF"/>
-                <w:sz w:val="21"/>
-              </w:rPr>
-              <w:t>Tool</w:t>
-            </w:r>
-          </w:p>
-        </w:tc>
-        <w:tc>
-          <w:tcPr>
-            <w:tcW w:type="dxa" w:w="4176"/>
-            <w:shd w:val="clear" w:fill="1D4ED8"/>
-          </w:tcPr>
-          <w:p>
-            <w:r/>
-            <w:r>
-              <w:rPr>
-                <w:b/>
-                <w:color w:val="FFFFFF"/>
-                <w:sz w:val="21"/>
-              </w:rPr>
-              <w:t>What it does</w:t>
-            </w:r>
-          </w:p>
-        </w:tc>
-        <w:tc>
-          <w:tcPr>
-            <w:tcW w:type="dxa" w:w="2736"/>
-            <w:shd w:val="clear" w:fill="1D4ED8"/>
-          </w:tcPr>
-          <w:p>
-            <w:r/>
-            <w:r>
-              <w:rPr>
-                <w:b/>
-                <w:color w:val="FFFFFF"/>
-                <w:sz w:val="21"/>
-              </w:rPr>
-              <w:t>Feeds</w:t>
-            </w:r>
-          </w:p>
-        </w:tc>
-      </w:tr>
-      <w:tr>
-        <w:tc>
-          <w:tcPr>
-            <w:tcW w:type="dxa" w:w="3168"/>
-          </w:tcPr>
-          <w:p>
-            <w:r/>
-            <w:r>
-              <w:rPr>
-                <w:sz w:val="21"/>
-              </w:rPr>
-              <w:t>Company Discovery</w:t>
-            </w:r>
-          </w:p>
-        </w:tc>
-        <w:tc>
-          <w:tcPr>
-            <w:tcW w:type="dxa" w:w="4176"/>
-          </w:tcPr>
-          <w:p>
-            <w:r/>
-            <w:r>
-              <w:rPr>
-                <w:sz w:val="21"/>
-              </w:rPr>
-              <w:t>surface private companies by thesis, sector, or website</w:t>
-            </w:r>
-          </w:p>
-        </w:tc>
-        <w:tc>
-          <w:tcPr>
-            <w:tcW w:type="dxa" w:w="2736"/>
-          </w:tcPr>
-          <w:p>
-            <w:r/>
-            <w:r>
-              <w:rPr>
-                <w:sz w:val="21"/>
-              </w:rPr>
-              <w:t>Market Map, Screener</w:t>
-            </w:r>
-          </w:p>
-        </w:tc>
-      </w:tr>
-      <w:tr>
-        <w:tc>
-          <w:tcPr>
-            <w:tcW w:type="dxa" w:w="3168"/>
-          </w:tcPr>
-          <w:p>
-            <w:r/>
-            <w:r>
-              <w:rPr>
-                <w:sz w:val="21"/>
-              </w:rPr>
-              <w:t>Target List Builder</w:t>
-            </w:r>
-          </w:p>
-        </w:tc>
-        <w:tc>
-          <w:tcPr>
-            <w:tcW w:type="dxa" w:w="4176"/>
-          </w:tcPr>
-          <w:p>
-            <w:r/>
-            <w:r>
-              <w:rPr>
-                <w:sz w:val="21"/>
-              </w:rPr>
-              <w:t>generate a ranked target universe from a plain-language brief</w:t>
-            </w:r>
-          </w:p>
-        </w:tc>
-        <w:tc>
-          <w:tcPr>
-            <w:tcW w:type="dxa" w:w="2736"/>
-          </w:tcPr>
-          <w:p>
-            <w:r/>
-            <w:r>
-              <w:rPr>
-                <w:sz w:val="21"/>
-              </w:rPr>
-              <w:t>Market Map, Bolt-On Finder</w:t>
-            </w:r>
-          </w:p>
-        </w:tc>
-      </w:tr>
-      <w:tr>
-        <w:tc>
-          <w:tcPr>
-            <w:tcW w:type="dxa" w:w="3168"/>
-          </w:tcPr>
-          <w:p>
-            <w:r/>
-            <w:r>
-              <w:rPr>
-                <w:sz w:val="21"/>
-              </w:rPr>
-              <w:t>Company Intelligence</w:t>
-            </w:r>
-          </w:p>
-        </w:tc>
-        <w:tc>
-          <w:tcPr>
-            <w:tcW w:type="dxa" w:w="4176"/>
-          </w:tcPr>
-          <w:p>
-            <w:r/>
-            <w:r>
-              <w:rPr>
-                <w:sz w:val="21"/>
-              </w:rPr>
-              <w:t>structured financial &amp; firmographic profile for any company</w:t>
-            </w:r>
-          </w:p>
-        </w:tc>
-        <w:tc>
-          <w:tcPr>
-            <w:tcW w:type="dxa" w:w="2736"/>
-          </w:tcPr>
-          <w:p>
-            <w:r/>
-            <w:r>
-              <w:rPr>
-                <w:sz w:val="21"/>
-              </w:rPr>
-              <w:t>Screener, One-Pager</w:t>
-            </w:r>
-          </w:p>
-        </w:tc>
-      </w:tr>
-      <w:tr>
-        <w:tc>
-          <w:tcPr>
-            <w:tcW w:type="dxa" w:w="3168"/>
-          </w:tcPr>
-          <w:p>
-            <w:r/>
-            <w:r>
-              <w:rPr>
-                <w:sz w:val="21"/>
-              </w:rPr>
-              <w:t>M&amp;A / Deal Search</w:t>
-            </w:r>
-          </w:p>
-        </w:tc>
-        <w:tc>
-          <w:tcPr>
-            <w:tcW w:type="dxa" w:w="4176"/>
-          </w:tcPr>
-          <w:p>
-            <w:r/>
-            <w:r>
-              <w:rPr>
-                <w:sz w:val="21"/>
-              </w:rPr>
-              <w:t>precedent transactions, acquirers &amp; active investors</w:t>
-            </w:r>
-          </w:p>
-        </w:tc>
-        <w:tc>
-          <w:tcPr>
-            <w:tcW w:type="dxa" w:w="2736"/>
-          </w:tcPr>
-          <w:p>
-            <w:r/>
-            <w:r>
-              <w:rPr>
-                <w:sz w:val="21"/>
-              </w:rPr>
-              <w:t>Comps &amp; Precedents</w:t>
-            </w:r>
-          </w:p>
-        </w:tc>
-      </w:tr>
-      <w:tr>
-        <w:tc>
-          <w:tcPr>
-            <w:tcW w:type="dxa" w:w="3168"/>
-          </w:tcPr>
-          <w:p>
-            <w:r/>
-            <w:r>
-              <w:rPr>
-                <w:sz w:val="21"/>
-              </w:rPr>
-              <w:t>People &amp; Leadership Finder</w:t>
-            </w:r>
-          </w:p>
-        </w:tc>
-        <w:tc>
-          <w:tcPr>
-            <w:tcW w:type="dxa" w:w="4176"/>
-          </w:tcPr>
-          <w:p>
-            <w:r/>
-            <w:r>
-              <w:rPr>
-                <w:sz w:val="21"/>
-              </w:rPr>
-              <w:t>decision-makers, CEOs &amp; verified contacts</w:t>
-            </w:r>
-          </w:p>
-        </w:tc>
-        <w:tc>
-          <w:tcPr>
-            <w:tcW w:type="dxa" w:w="2736"/>
-          </w:tcPr>
-          <w:p>
-            <w:r/>
-            <w:r>
-              <w:rPr>
-                <w:sz w:val="21"/>
-              </w:rPr>
-              <w:t>Warm-Path, Management Call Prep</w:t>
-            </w:r>
-          </w:p>
-        </w:tc>
-      </w:tr>
-      <w:tr>
-        <w:tc>
-          <w:tcPr>
-            <w:tcW w:type="dxa" w:w="3168"/>
-          </w:tcPr>
-          <w:p>
-            <w:r/>
-            <w:r>
-              <w:rPr>
-                <w:sz w:val="21"/>
-              </w:rPr>
-              <w:t>News &amp; Signal Search</w:t>
-            </w:r>
-          </w:p>
-        </w:tc>
-        <w:tc>
-          <w:tcPr>
-            <w:tcW w:type="dxa" w:w="4176"/>
-          </w:tcPr>
-          <w:p>
-            <w:r/>
-            <w:r>
-              <w:rPr>
-                <w:sz w:val="21"/>
-              </w:rPr>
-              <w:t>vetted news &amp; market signals on a target</w:t>
-            </w:r>
-          </w:p>
-        </w:tc>
-        <w:tc>
-          <w:tcPr>
-            <w:tcW w:type="dxa" w:w="2736"/>
-          </w:tcPr>
-          <w:p>
-            <w:r/>
-            <w:r>
-              <w:rPr>
-                <w:sz w:val="21"/>
-              </w:rPr>
-              <w:t>Red-Flag Scan, KPI Monitoring</w:t>
-            </w:r>
-          </w:p>
-        </w:tc>
-      </w:tr>
-    </w:tbl>
     <w:p>
       <w:pPr>
-        <w:spacing w:after="40"/>
+        <w:pStyle w:val="ListBullet"/>
       </w:pPr>
+      <w:r>
+        <w:rPr>
+          <w:b/>
+        </w:rPr>
+        <w:t>Company Discovery</w:t>
+      </w:r>
+      <w:r>
+        <w:rPr>
+          <w:color w:val="5B6B85"/>
+        </w:rPr>
+        <w:t>— surface private companies</w:t>
+      </w:r>
+      <w:r>
+        <w:rPr>
+          <w:b/>
+          <w:color w:val="1D4ED8"/>
+          <w:sz w:val="16"/>
+        </w:rPr>
+        <w:t xml:space="preserve">   ★ live demo</w:t>
+      </w:r>
+    </w:p>
+    <w:p>
+      <w:pPr>
+        <w:pStyle w:val="ListBullet"/>
+      </w:pPr>
+      <w:r>
+        <w:rPr>
+          <w:b/>
+        </w:rPr>
+        <w:t>Target List Builder</w:t>
+      </w:r>
+      <w:r>
+        <w:rPr>
+          <w:color w:val="5B6B85"/>
+        </w:rPr>
+        <w:t>— ranked target universe</w:t>
+      </w:r>
+    </w:p>
+    <w:p>
+      <w:pPr>
+        <w:pStyle w:val="ListBullet"/>
+      </w:pPr>
+      <w:r>
+        <w:rPr>
+          <w:b/>
+        </w:rPr>
+        <w:t>Company Intelligence</w:t>
+      </w:r>
+      <w:r>
+        <w:rPr>
+          <w:color w:val="5B6B85"/>
+        </w:rPr>
+        <w:t>— financial &amp; firmographic profile</w:t>
+      </w:r>
+    </w:p>
+    <w:p>
+      <w:pPr>
+        <w:pStyle w:val="ListBullet"/>
+      </w:pPr>
+      <w:r>
+        <w:rPr>
+          <w:b/>
+        </w:rPr>
+        <w:t>M&amp;A / Deal Search</w:t>
+      </w:r>
+      <w:r>
+        <w:rPr>
+          <w:color w:val="5B6B85"/>
+        </w:rPr>
+        <w:t>— precedents, acquirers &amp; investors</w:t>
+      </w:r>
     </w:p>
     <w:p>
       <w:pPr>
         <w:pStyle w:val="Heading2"/>
       </w:pPr>
       <w:r>
-        <w:t>Your firm’s connected data — the paid systems you already trust</w:t>
+        <w:t>Your connected data</w:t>
       </w:r>
     </w:p>
-    <w:tbl>
-      <w:tblPr>
-        <w:tblStyle w:val="TableGrid"/>
-        <w:tblW w:type="auto" w:w="0"/>
-        <w:jc w:val="left"/>
-        <w:tblLook w:firstColumn="1" w:firstRow="1" w:lastColumn="0" w:lastRow="0" w:noHBand="0" w:noVBand="1" w:val="04A0"/>
-      </w:tblPr>
-      <w:tblGrid>
-        <w:gridCol w:w="2880"/>
-        <w:gridCol w:w="2880"/>
-        <w:gridCol w:w="2880"/>
-      </w:tblGrid>
-      <w:tr>
-        <w:tc>
-          <w:tcPr>
-            <w:tcW w:type="dxa" w:w="3168"/>
-            <w:shd w:val="clear" w:fill="1D4ED8"/>
-          </w:tcPr>
-          <w:p>
-            <w:r/>
-            <w:r>
-              <w:rPr>
-                <w:b/>
-                <w:color w:val="FFFFFF"/>
-                <w:sz w:val="21"/>
-              </w:rPr>
-              <w:t>System</w:t>
-            </w:r>
-          </w:p>
-        </w:tc>
-        <w:tc>
-          <w:tcPr>
-            <w:tcW w:type="dxa" w:w="4176"/>
-            <w:shd w:val="clear" w:fill="1D4ED8"/>
-          </w:tcPr>
-          <w:p>
-            <w:r/>
-            <w:r>
-              <w:rPr>
-                <w:b/>
-                <w:color w:val="FFFFFF"/>
-                <w:sz w:val="21"/>
-              </w:rPr>
-              <w:t>What it is</w:t>
-            </w:r>
-          </w:p>
-        </w:tc>
-        <w:tc>
-          <w:tcPr>
-            <w:tcW w:type="dxa" w:w="2736"/>
-            <w:shd w:val="clear" w:fill="1D4ED8"/>
-          </w:tcPr>
-          <w:p>
-            <w:r/>
-            <w:r>
-              <w:rPr>
-                <w:b/>
-                <w:color w:val="FFFFFF"/>
-                <w:sz w:val="21"/>
-              </w:rPr>
-              <w:t>Feeds</w:t>
-            </w:r>
-          </w:p>
-        </w:tc>
-      </w:tr>
-      <w:tr>
-        <w:tc>
-          <w:tcPr>
-            <w:tcW w:type="dxa" w:w="3168"/>
-          </w:tcPr>
-          <w:p>
-            <w:r/>
-            <w:r>
-              <w:rPr>
-                <w:sz w:val="21"/>
-              </w:rPr>
-              <w:t>PitchBook</w:t>
-            </w:r>
-          </w:p>
-        </w:tc>
-        <w:tc>
-          <w:tcPr>
-            <w:tcW w:type="dxa" w:w="4176"/>
-          </w:tcPr>
-          <w:p>
-            <w:r/>
-            <w:r>
-              <w:rPr>
-                <w:sz w:val="21"/>
-              </w:rPr>
-              <w:t>private company financials, deal comps &amp; fund data</w:t>
-            </w:r>
-          </w:p>
-        </w:tc>
-        <w:tc>
-          <w:tcPr>
-            <w:tcW w:type="dxa" w:w="2736"/>
-          </w:tcPr>
-          <w:p>
-            <w:r/>
-            <w:r>
-              <w:rPr>
-                <w:sz w:val="21"/>
-              </w:rPr>
-              <w:t>Market Map, Comps, Screener</w:t>
-            </w:r>
-          </w:p>
-        </w:tc>
-      </w:tr>
-      <w:tr>
-        <w:tc>
-          <w:tcPr>
-            <w:tcW w:type="dxa" w:w="3168"/>
-          </w:tcPr>
-          <w:p>
-            <w:r/>
-            <w:r>
-              <w:rPr>
-                <w:sz w:val="21"/>
-              </w:rPr>
-              <w:t>ZoomInfo</w:t>
-            </w:r>
-          </w:p>
-        </w:tc>
-        <w:tc>
-          <w:tcPr>
-            <w:tcW w:type="dxa" w:w="4176"/>
-          </w:tcPr>
-          <w:p>
-            <w:r/>
-            <w:r>
-              <w:rPr>
-                <w:sz w:val="21"/>
-              </w:rPr>
-              <w:t>firmographics, org charts &amp; contacts</w:t>
-            </w:r>
-          </w:p>
-        </w:tc>
-        <w:tc>
-          <w:tcPr>
-            <w:tcW w:type="dxa" w:w="2736"/>
-          </w:tcPr>
-          <w:p>
-            <w:r/>
-            <w:r>
-              <w:rPr>
-                <w:sz w:val="21"/>
-              </w:rPr>
-              <w:t>Sourcing, Warm-Path</w:t>
-            </w:r>
-          </w:p>
-        </w:tc>
-      </w:tr>
-      <w:tr>
-        <w:tc>
-          <w:tcPr>
-            <w:tcW w:type="dxa" w:w="3168"/>
-          </w:tcPr>
-          <w:p>
-            <w:r/>
-            <w:r>
-              <w:rPr>
-                <w:sz w:val="21"/>
-              </w:rPr>
-              <w:t>Apollo.io</w:t>
-            </w:r>
-          </w:p>
-        </w:tc>
-        <w:tc>
-          <w:tcPr>
-            <w:tcW w:type="dxa" w:w="4176"/>
-          </w:tcPr>
-          <w:p>
-            <w:r/>
-            <w:r>
-              <w:rPr>
-                <w:sz w:val="21"/>
-              </w:rPr>
-              <w:t>company &amp; contact intelligence</w:t>
-            </w:r>
-          </w:p>
-        </w:tc>
-        <w:tc>
-          <w:tcPr>
-            <w:tcW w:type="dxa" w:w="2736"/>
-          </w:tcPr>
-          <w:p>
-            <w:r/>
-            <w:r>
-              <w:rPr>
-                <w:sz w:val="21"/>
-              </w:rPr>
-              <w:t>Prospecting, Outreach</w:t>
-            </w:r>
-          </w:p>
-        </w:tc>
-      </w:tr>
-      <w:tr>
-        <w:tc>
-          <w:tcPr>
-            <w:tcW w:type="dxa" w:w="3168"/>
-          </w:tcPr>
-          <w:p>
-            <w:r/>
-            <w:r>
-              <w:rPr>
-                <w:sz w:val="21"/>
-              </w:rPr>
-              <w:t>LSEG</w:t>
-            </w:r>
-          </w:p>
-        </w:tc>
-        <w:tc>
-          <w:tcPr>
-            <w:tcW w:type="dxa" w:w="4176"/>
-          </w:tcPr>
-          <w:p>
-            <w:r/>
-            <w:r>
-              <w:rPr>
-                <w:sz w:val="21"/>
-              </w:rPr>
-              <w:t>public comps, market &amp; credit data</w:t>
-            </w:r>
-          </w:p>
-        </w:tc>
-        <w:tc>
-          <w:tcPr>
-            <w:tcW w:type="dxa" w:w="2736"/>
-          </w:tcPr>
-          <w:p>
-            <w:r/>
-            <w:r>
-              <w:rPr>
-                <w:sz w:val="21"/>
-              </w:rPr>
-              <w:t>Comps, Valuation</w:t>
-            </w:r>
-          </w:p>
-        </w:tc>
-      </w:tr>
-      <w:tr>
-        <w:tc>
-          <w:tcPr>
-            <w:tcW w:type="dxa" w:w="3168"/>
-          </w:tcPr>
-          <w:p>
-            <w:r/>
-            <w:r>
-              <w:rPr>
-                <w:sz w:val="21"/>
-              </w:rPr>
-              <w:t>Salesforce / HubSpot</w:t>
-            </w:r>
-          </w:p>
-        </w:tc>
-        <w:tc>
-          <w:tcPr>
-            <w:tcW w:type="dxa" w:w="4176"/>
-          </w:tcPr>
-          <w:p>
-            <w:r/>
-            <w:r>
-              <w:rPr>
-                <w:sz w:val="21"/>
-              </w:rPr>
-              <w:t>accounts, pipeline &amp; relationship history</w:t>
-            </w:r>
-          </w:p>
-        </w:tc>
-        <w:tc>
-          <w:tcPr>
-            <w:tcW w:type="dxa" w:w="2736"/>
-          </w:tcPr>
-          <w:p>
-            <w:r/>
-            <w:r>
-              <w:rPr>
-                <w:sz w:val="21"/>
-              </w:rPr>
-              <w:t>Pipeline, Warm-Path, CRM sync</w:t>
-            </w:r>
-          </w:p>
-        </w:tc>
-      </w:tr>
-      <w:tr>
-        <w:tc>
-          <w:tcPr>
-            <w:tcW w:type="dxa" w:w="3168"/>
-          </w:tcPr>
-          <w:p>
-            <w:r/>
-            <w:r>
-              <w:rPr>
-                <w:sz w:val="21"/>
-              </w:rPr>
-              <w:t>Microsoft 365 / Google Drive</w:t>
-            </w:r>
-          </w:p>
-        </w:tc>
-        <w:tc>
-          <w:tcPr>
-            <w:tcW w:type="dxa" w:w="4176"/>
-          </w:tcPr>
-          <w:p>
-            <w:r/>
-            <w:r>
-              <w:rPr>
-                <w:sz w:val="21"/>
-              </w:rPr>
-              <w:t>data rooms, memos &amp; models</w:t>
-            </w:r>
-          </w:p>
-        </w:tc>
-        <w:tc>
-          <w:tcPr>
-            <w:tcW w:type="dxa" w:w="2736"/>
-          </w:tcPr>
-          <w:p>
-            <w:r/>
-            <w:r>
-              <w:rPr>
-                <w:sz w:val="21"/>
-              </w:rPr>
-              <w:t>Summarizer, every drafting skill</w:t>
-            </w:r>
-          </w:p>
-        </w:tc>
-      </w:tr>
-    </w:tbl>
     <w:p>
       <w:pPr>
-        <w:spacing w:after="40"/>
+        <w:pStyle w:val="ListBullet"/>
       </w:pPr>
+      <w:r>
+        <w:rPr>
+          <w:b/>
+        </w:rPr>
+        <w:t>PitchBook</w:t>
+      </w:r>
+      <w:r>
+        <w:rPr>
+          <w:color w:val="5B6B85"/>
+        </w:rPr>
+        <w:t>— financials, comps &amp; funds</w:t>
+      </w:r>
+    </w:p>
+    <w:p>
+      <w:pPr>
+        <w:pStyle w:val="ListBullet"/>
+      </w:pPr>
+      <w:r>
+        <w:rPr>
+          <w:b/>
+        </w:rPr>
+        <w:t>ZoomInfo</w:t>
+      </w:r>
+      <w:r>
+        <w:rPr>
+          <w:color w:val="5B6B85"/>
+        </w:rPr>
+        <w:t>— firmographics &amp; contacts</w:t>
+      </w:r>
+    </w:p>
+    <w:p>
+      <w:pPr>
+        <w:pStyle w:val="ListBullet"/>
+      </w:pPr>
+      <w:r>
+        <w:rPr>
+          <w:b/>
+        </w:rPr>
+        <w:t>LSEG</w:t>
+      </w:r>
+      <w:r>
+        <w:rPr>
+          <w:color w:val="5B6B85"/>
+        </w:rPr>
+        <w:t>— public comps &amp; credit</w:t>
+      </w:r>
+    </w:p>
+    <w:p>
+      <w:pPr>
+        <w:pStyle w:val="ListBullet"/>
+      </w:pPr>
+      <w:r>
+        <w:rPr>
+          <w:b/>
+        </w:rPr>
+        <w:t>Microsoft 365 / Google Drive</w:t>
+      </w:r>
+      <w:r>
+        <w:rPr>
+          <w:color w:val="5B6B85"/>
+        </w:rPr>
+        <w:t>— data rooms, memos &amp; models</w:t>
+      </w:r>
+    </w:p>
+    <w:p>
+      <w:pPr>
+        <w:spacing w:before="180" w:after="20"/>
+      </w:pPr>
+      <w:r>
+        <w:rPr>
+          <w:b/>
+          <w:color w:val="1D4ED8"/>
+          <w:sz w:val="18"/>
+        </w:rPr>
+        <w:t>LIVE DEMO — HIGHLIGHTED: COMPANY DISCOVERY</w:t>
+      </w:r>
+    </w:p>
+    <w:p>
+      <w:r>
+        <w:rPr>
+          <w:b/>
+          <w:i w:val="0"/>
+        </w:rPr>
+        <w:t>User asks:</w:t>
+      </w:r>
+    </w:p>
+    <w:p>
+      <w:pPr>
+        <w:pBdr>
+          <w:left w:val="single" w:sz="18" w:space="8" w:color="1D4ED8"/>
+        </w:pBdr>
+        <w:spacing w:after="100"/>
+        <w:ind w:left="200"/>
+      </w:pPr>
+      <w:r>
+        <w:rPr>
+          <w:i/>
+          <w:sz w:val="24"/>
+        </w:rPr>
+        <w:t>“Find founder-owned vertical-SaaS companies in Europe, €5–20M revenue.”</w:t>
+      </w:r>
+    </w:p>
+    <w:p>
+      <w:r>
+        <w:rPr>
+          <w:b/>
+          <w:i w:val="0"/>
+        </w:rPr>
+        <w:t>Claude responds:</w:t>
+      </w:r>
+    </w:p>
+    <w:p>
+      <w:r>
+        <w:rPr>
+          <w:b w:val="0"/>
+          <w:i w:val="0"/>
+          <w:color w:val="5B6B85"/>
+        </w:rPr>
+        <w:t>Scanning live sources across the web, PitchBook and Tracxn…</w:t>
+      </w:r>
+    </w:p>
+    <w:p>
+      <w:r>
+        <w:rPr>
+          <w:b w:val="0"/>
+          <w:i w:val="0"/>
+          <w:color w:val="5B6B85"/>
+        </w:rPr>
+        <w:t>47 private companies match. Filtered to founder-owned, €5–20M revenue, EU-HQ and enriched each with sector, revenue estimate and website.</w:t>
+      </w:r>
+    </w:p>
+    <w:p>
+      <w:r>
+        <w:rPr>
+          <w:b/>
+          <w:i w:val="0"/>
+        </w:rPr>
+        <w:t>Output shown:</w:t>
+      </w:r>
+    </w:p>
+    <w:p>
+      <w:pPr>
+        <w:pStyle w:val="ListBullet"/>
+      </w:pPr>
+      <w:r>
+        <w:rPr>
+          <w:b/>
+        </w:rPr>
+        <w:t xml:space="preserve">Company Discovery · 47 matches: </w:t>
+      </w:r>
+      <w:r>
+        <w:rPr>
+          <w:color w:val="5B6B85"/>
+        </w:rPr>
+        <w:t>Northwind Freight OS €18M·NL · Cargoflow €12M·DE · Portbase Labs €9M·BE · Transply €6M·SE · + 43 more (ranked by fit)</w:t>
+      </w:r>
+    </w:p>
+    <w:p>
+      <w:r>
+        <w:rPr>
+          <w:b w:val="0"/>
+          <w:i/>
+          <w:color w:val="5B6B85"/>
+        </w:rPr>
+        <w:t>→ 47 sent to Market Map &amp; Screener</w:t>
+      </w:r>
     </w:p>
     <w:p>
       <w:pPr>
         <w:pBdr>
           <w:bottom w:val="single" w:sz="6" w:space="1" w:color="D5E2FF"/>
         </w:pBdr>
-        <w:spacing w:before="40" w:after="160"/>
+        <w:spacing w:before="80" w:after="160"/>
       </w:pPr>
     </w:p>
     <w:p>
@@ -1500,441 +1043,205 @@
     <w:p>
       <w:r>
         <w:rPr>
+          <w:b w:val="0"/>
           <w:i w:val="0"/>
           <w:color w:val="5B6B85"/>
         </w:rPr>
-        <w:t>The proprietary knowledge that makes the engine reason like your firm — not a generic model. Built from what’s already in heads and files. (e.g. “Which fintech deals did we pass on last cycle — and why?”)</w:t>
+        <w:t>The proprietary knowledge that makes the engine reason like your firm — not a generic model. Built from what’s already in heads and files.</w:t>
       </w:r>
     </w:p>
-    <w:tbl>
-      <w:tblPr>
-        <w:tblStyle w:val="TableGrid"/>
-        <w:tblW w:type="auto" w:w="0"/>
-        <w:jc w:val="left"/>
-        <w:tblLook w:firstColumn="1" w:firstRow="1" w:lastColumn="0" w:lastRow="0" w:noHBand="0" w:noVBand="1" w:val="04A0"/>
-      </w:tblPr>
-      <w:tblGrid>
-        <w:gridCol w:w="2880"/>
-        <w:gridCol w:w="2880"/>
-        <w:gridCol w:w="2880"/>
-      </w:tblGrid>
-      <w:tr>
-        <w:tc>
-          <w:tcPr>
-            <w:tcW w:type="dxa" w:w="3024"/>
-            <w:shd w:val="clear" w:fill="1D4ED8"/>
-          </w:tcPr>
-          <w:p>
-            <w:r/>
-            <w:r>
-              <w:rPr>
-                <w:b/>
-                <w:color w:val="FFFFFF"/>
-                <w:sz w:val="21"/>
-              </w:rPr>
-              <w:t>Knowledge base</w:t>
-            </w:r>
-          </w:p>
-        </w:tc>
-        <w:tc>
-          <w:tcPr>
-            <w:tcW w:type="dxa" w:w="3888"/>
-            <w:shd w:val="clear" w:fill="1D4ED8"/>
-          </w:tcPr>
-          <w:p>
-            <w:r/>
-            <w:r>
-              <w:rPr>
-                <w:b/>
-                <w:color w:val="FFFFFF"/>
-                <w:sz w:val="21"/>
-              </w:rPr>
-              <w:t>What it holds</w:t>
-            </w:r>
-          </w:p>
-        </w:tc>
-        <w:tc>
-          <w:tcPr>
-            <w:tcW w:type="dxa" w:w="3168"/>
-            <w:shd w:val="clear" w:fill="1D4ED8"/>
-          </w:tcPr>
-          <w:p>
-            <w:r/>
-            <w:r>
-              <w:rPr>
-                <w:b/>
-                <w:color w:val="FFFFFF"/>
-                <w:sz w:val="21"/>
-              </w:rPr>
-              <w:t>Examples</w:t>
-            </w:r>
-          </w:p>
-        </w:tc>
-      </w:tr>
-      <w:tr>
-        <w:tc>
-          <w:tcPr>
-            <w:tcW w:type="dxa" w:w="3024"/>
-          </w:tcPr>
-          <w:p>
-            <w:r/>
-            <w:r>
-              <w:rPr>
-                <w:sz w:val="21"/>
-              </w:rPr>
-              <w:t>Investment thesis library</w:t>
-            </w:r>
-          </w:p>
-        </w:tc>
-        <w:tc>
-          <w:tcPr>
-            <w:tcW w:type="dxa" w:w="3888"/>
-          </w:tcPr>
-          <w:p>
-            <w:r/>
-            <w:r>
-              <w:rPr>
-                <w:sz w:val="21"/>
-              </w:rPr>
-              <w:t>by sector and strategy</w:t>
-            </w:r>
-          </w:p>
-        </w:tc>
-        <w:tc>
-          <w:tcPr>
-            <w:tcW w:type="dxa" w:w="3168"/>
-          </w:tcPr>
-          <w:p>
-            <w:r/>
-            <w:r>
-              <w:rPr>
-                <w:sz w:val="21"/>
-              </w:rPr>
-              <w:t>SaaS rule-of-40, Healthcare roll-ups, Buy-and-build</w:t>
-            </w:r>
-          </w:p>
-        </w:tc>
-      </w:tr>
-      <w:tr>
-        <w:tc>
-          <w:tcPr>
-            <w:tcW w:type="dxa" w:w="3024"/>
-          </w:tcPr>
-          <w:p>
-            <w:r/>
-            <w:r>
-              <w:rPr>
-                <w:sz w:val="21"/>
-              </w:rPr>
-              <w:t>Diligence playbooks</w:t>
-            </w:r>
-          </w:p>
-        </w:tc>
-        <w:tc>
-          <w:tcPr>
-            <w:tcW w:type="dxa" w:w="3888"/>
-          </w:tcPr>
-          <w:p>
-            <w:r/>
-            <w:r>
-              <w:rPr>
-                <w:sz w:val="21"/>
-              </w:rPr>
-              <w:t>your red-flag patterns &amp; DD checklists</w:t>
-            </w:r>
-          </w:p>
-        </w:tc>
-        <w:tc>
-          <w:tcPr>
-            <w:tcW w:type="dxa" w:w="3168"/>
-          </w:tcPr>
-          <w:p>
-            <w:r/>
-            <w:r>
-              <w:rPr>
-                <w:sz w:val="21"/>
-              </w:rPr>
-              <w:t>Customer concentration, Churn, Working capital</w:t>
-            </w:r>
-          </w:p>
-        </w:tc>
-      </w:tr>
-      <w:tr>
-        <w:tc>
-          <w:tcPr>
-            <w:tcW w:type="dxa" w:w="3024"/>
-          </w:tcPr>
-          <w:p>
-            <w:r/>
-            <w:r>
-              <w:rPr>
-                <w:sz w:val="21"/>
-              </w:rPr>
-              <w:t>Past IC memos &amp; post-mortems</w:t>
-            </w:r>
-          </w:p>
-        </w:tc>
-        <w:tc>
-          <w:tcPr>
-            <w:tcW w:type="dxa" w:w="3888"/>
-          </w:tcPr>
-          <w:p>
-            <w:r/>
-            <w:r>
-              <w:rPr>
-                <w:sz w:val="21"/>
-              </w:rPr>
-              <w:t>what you approved, passed on, and why</w:t>
-            </w:r>
-          </w:p>
-        </w:tc>
-        <w:tc>
-          <w:tcPr>
-            <w:tcW w:type="dxa" w:w="3168"/>
-          </w:tcPr>
-          <w:p>
-            <w:r/>
-            <w:r>
-              <w:rPr>
-                <w:sz w:val="21"/>
-              </w:rPr>
-              <w:t>Won deals, Passed deals, Lessons</w:t>
-            </w:r>
-          </w:p>
-        </w:tc>
-      </w:tr>
-      <w:tr>
-        <w:tc>
-          <w:tcPr>
-            <w:tcW w:type="dxa" w:w="3024"/>
-          </w:tcPr>
-          <w:p>
-            <w:r/>
-            <w:r>
-              <w:rPr>
-                <w:sz w:val="21"/>
-              </w:rPr>
-              <w:t>Sector playbooks</w:t>
-            </w:r>
-          </w:p>
-        </w:tc>
-        <w:tc>
-          <w:tcPr>
-            <w:tcW w:type="dxa" w:w="3888"/>
-          </w:tcPr>
-          <w:p>
-            <w:r/>
-            <w:r>
-              <w:rPr>
-                <w:sz w:val="21"/>
-              </w:rPr>
-              <w:t>how the firm wins in each vertical</w:t>
-            </w:r>
-          </w:p>
-        </w:tc>
-        <w:tc>
-          <w:tcPr>
-            <w:tcW w:type="dxa" w:w="3168"/>
-          </w:tcPr>
-          <w:p>
-            <w:r/>
-            <w:r>
-              <w:rPr>
-                <w:sz w:val="21"/>
-              </w:rPr>
-              <w:t>Industrials, Software, Consumer</w:t>
-            </w:r>
-          </w:p>
-        </w:tc>
-      </w:tr>
-      <w:tr>
-        <w:tc>
-          <w:tcPr>
-            <w:tcW w:type="dxa" w:w="3024"/>
-          </w:tcPr>
-          <w:p>
-            <w:r/>
-            <w:r>
-              <w:rPr>
-                <w:sz w:val="21"/>
-              </w:rPr>
-              <w:t>Valuation benchmarks</w:t>
-            </w:r>
-          </w:p>
-        </w:tc>
-        <w:tc>
-          <w:tcPr>
-            <w:tcW w:type="dxa" w:w="3888"/>
-          </w:tcPr>
-          <w:p>
-            <w:r/>
-            <w:r>
-              <w:rPr>
-                <w:sz w:val="21"/>
-              </w:rPr>
-              <w:t>your comps logic &amp; pricing discipline</w:t>
-            </w:r>
-          </w:p>
-        </w:tc>
-        <w:tc>
-          <w:tcPr>
-            <w:tcW w:type="dxa" w:w="3168"/>
-          </w:tcPr>
-          <w:p>
-            <w:r/>
-            <w:r>
-              <w:rPr>
-                <w:sz w:val="21"/>
-              </w:rPr>
-              <w:t>EV/EBITDA, Entry multiples, Sector medians</w:t>
-            </w:r>
-          </w:p>
-        </w:tc>
-      </w:tr>
-      <w:tr>
-        <w:tc>
-          <w:tcPr>
-            <w:tcW w:type="dxa" w:w="3024"/>
-          </w:tcPr>
-          <w:p>
-            <w:r/>
-            <w:r>
-              <w:rPr>
-                <w:sz w:val="21"/>
-              </w:rPr>
-              <w:t>Value-creation playbooks</w:t>
-            </w:r>
-          </w:p>
-        </w:tc>
-        <w:tc>
-          <w:tcPr>
-            <w:tcW w:type="dxa" w:w="3888"/>
-          </w:tcPr>
-          <w:p>
-            <w:r/>
-            <w:r>
-              <w:rPr>
-                <w:sz w:val="21"/>
-              </w:rPr>
-              <w:t>the operating moves that actually worked</w:t>
-            </w:r>
-          </w:p>
-        </w:tc>
-        <w:tc>
-          <w:tcPr>
-            <w:tcW w:type="dxa" w:w="3168"/>
-          </w:tcPr>
-          <w:p>
-            <w:r/>
-            <w:r>
-              <w:rPr>
-                <w:sz w:val="21"/>
-              </w:rPr>
-              <w:t>Pricing, GTM, Bolt-ons</w:t>
-            </w:r>
-          </w:p>
-        </w:tc>
-      </w:tr>
-      <w:tr>
-        <w:tc>
-          <w:tcPr>
-            <w:tcW w:type="dxa" w:w="3024"/>
-          </w:tcPr>
-          <w:p>
-            <w:r/>
-            <w:r>
-              <w:rPr>
-                <w:sz w:val="21"/>
-              </w:rPr>
-              <w:t>Expert &amp; reference-call notes</w:t>
-            </w:r>
-          </w:p>
-        </w:tc>
-        <w:tc>
-          <w:tcPr>
-            <w:tcW w:type="dxa" w:w="3888"/>
-          </w:tcPr>
-          <w:p>
-            <w:r/>
-            <w:r>
-              <w:rPr>
-                <w:sz w:val="21"/>
-              </w:rPr>
-              <w:t>primary insight, never lost</w:t>
-            </w:r>
-          </w:p>
-        </w:tc>
-        <w:tc>
-          <w:tcPr>
-            <w:tcW w:type="dxa" w:w="3168"/>
-          </w:tcPr>
-          <w:p>
-            <w:r/>
-            <w:r>
-              <w:rPr>
-                <w:sz w:val="21"/>
-              </w:rPr>
-              <w:t>Expert calls, Customer refs, Channel checks</w:t>
-            </w:r>
-          </w:p>
-        </w:tc>
-      </w:tr>
-      <w:tr>
-        <w:tc>
-          <w:tcPr>
-            <w:tcW w:type="dxa" w:w="3024"/>
-          </w:tcPr>
-          <w:p>
-            <w:r/>
-            <w:r>
-              <w:rPr>
-                <w:sz w:val="21"/>
-              </w:rPr>
-              <w:t>Deal precedents database</w:t>
-            </w:r>
-          </w:p>
-        </w:tc>
-        <w:tc>
-          <w:tcPr>
-            <w:tcW w:type="dxa" w:w="3888"/>
-          </w:tcPr>
-          <w:p>
-            <w:r/>
-            <w:r>
-              <w:rPr>
-                <w:sz w:val="21"/>
-              </w:rPr>
-              <w:t>terms &amp; structures from prior transactions</w:t>
-            </w:r>
-          </w:p>
-        </w:tc>
-        <w:tc>
-          <w:tcPr>
-            <w:tcW w:type="dxa" w:w="3168"/>
-          </w:tcPr>
-          <w:p>
-            <w:r/>
-            <w:r>
-              <w:rPr>
-                <w:sz w:val="21"/>
-              </w:rPr>
-              <w:t>Earnouts, Rollover equity, Deal terms</w:t>
-            </w:r>
-          </w:p>
-        </w:tc>
-      </w:tr>
-    </w:tbl>
     <w:p>
       <w:pPr>
-        <w:spacing w:after="40"/>
+        <w:pStyle w:val="ListBullet"/>
       </w:pPr>
+      <w:r>
+        <w:rPr>
+          <w:b/>
+        </w:rPr>
+        <w:t>Investment thesis library</w:t>
+      </w:r>
+      <w:r>
+        <w:rPr>
+          <w:color w:val="5B6B85"/>
+        </w:rPr>
+        <w:t>— by sector &amp; strategy</w:t>
+      </w:r>
+      <w:r>
+        <w:rPr>
+          <w:b/>
+          <w:color w:val="1D4ED8"/>
+          <w:sz w:val="16"/>
+        </w:rPr>
+        <w:t xml:space="preserve">   ★ live demo</w:t>
+      </w:r>
+    </w:p>
+    <w:p>
+      <w:pPr>
+        <w:pStyle w:val="ListBullet"/>
+      </w:pPr>
+      <w:r>
+        <w:rPr>
+          <w:b/>
+        </w:rPr>
+        <w:t>Diligence playbooks</w:t>
+      </w:r>
+      <w:r>
+        <w:rPr>
+          <w:color w:val="5B6B85"/>
+        </w:rPr>
+        <w:t>— red-flag patterns &amp; DD checklists</w:t>
+      </w:r>
+    </w:p>
+    <w:p>
+      <w:pPr>
+        <w:pStyle w:val="ListBullet"/>
+      </w:pPr>
+      <w:r>
+        <w:rPr>
+          <w:b/>
+        </w:rPr>
+        <w:t>Past IC memos &amp; post-mortems</w:t>
+      </w:r>
+      <w:r>
+        <w:rPr>
+          <w:color w:val="5B6B85"/>
+        </w:rPr>
+        <w:t>— what you approved, passed on &amp; why</w:t>
+      </w:r>
+    </w:p>
+    <w:p>
+      <w:pPr>
+        <w:pStyle w:val="ListBullet"/>
+      </w:pPr>
+      <w:r>
+        <w:rPr>
+          <w:b/>
+        </w:rPr>
+        <w:t>Valuation benchmarks</w:t>
+      </w:r>
+      <w:r>
+        <w:rPr>
+          <w:color w:val="5B6B85"/>
+        </w:rPr>
+        <w:t>— comps logic &amp; pricing discipline</w:t>
+      </w:r>
+    </w:p>
+    <w:p>
+      <w:pPr>
+        <w:spacing w:before="180" w:after="20"/>
+      </w:pPr>
+      <w:r>
+        <w:rPr>
+          <w:b/>
+          <w:color w:val="1D4ED8"/>
+          <w:sz w:val="18"/>
+        </w:rPr>
+        <w:t>LIVE DEMO — HIGHLIGHTED: INVESTMENT THESIS LIBRARY</w:t>
+      </w:r>
+    </w:p>
+    <w:p>
+      <w:r>
+        <w:rPr>
+          <w:b/>
+          <w:i w:val="0"/>
+        </w:rPr>
+        <w:t>User asks:</w:t>
+      </w:r>
+    </w:p>
+    <w:p>
+      <w:pPr>
+        <w:pBdr>
+          <w:left w:val="single" w:sz="18" w:space="8" w:color="1D4ED8"/>
+        </w:pBdr>
+        <w:spacing w:after="100"/>
+        <w:ind w:left="200"/>
+      </w:pPr>
+      <w:r>
+        <w:rPr>
+          <w:i/>
+          <w:sz w:val="24"/>
+        </w:rPr>
+        <w:t>“Does Project Atlas meet our investment thesis?”</w:t>
+      </w:r>
+    </w:p>
+    <w:p>
+      <w:r>
+        <w:rPr>
+          <w:b/>
+          <w:i w:val="0"/>
+        </w:rPr>
+        <w:t>Claude responds:</w:t>
+      </w:r>
+    </w:p>
+    <w:p>
+      <w:r>
+        <w:rPr>
+          <w:b w:val="0"/>
+          <w:i w:val="0"/>
+          <w:color w:val="5B6B85"/>
+        </w:rPr>
+        <w:t>Retrieving your vertical-SaaS thesis and scoring Atlas against each criterion…</w:t>
+      </w:r>
+    </w:p>
+    <w:p>
+      <w:r>
+        <w:rPr>
+          <w:b w:val="0"/>
+          <w:i w:val="0"/>
+          <w:color w:val="5B6B85"/>
+        </w:rPr>
+        <w:t>Atlas meets 4 of your 5 thesis tests — strong on growth, ownership and retention, with one flag on customer concentration to diligence.</w:t>
+      </w:r>
+    </w:p>
+    <w:p>
+      <w:r>
+        <w:rPr>
+          <w:b/>
+          <w:i w:val="0"/>
+        </w:rPr>
+        <w:t>Output shown:</w:t>
+      </w:r>
+    </w:p>
+    <w:p>
+      <w:pPr>
+        <w:pStyle w:val="ListBullet"/>
+      </w:pPr>
+      <w:r>
+        <w:rPr>
+          <w:b/>
+        </w:rPr>
+        <w:t xml:space="preserve">Thesis-fit scorecard: </w:t>
+      </w:r>
+      <w:r>
+        <w:rPr>
+          <w:color w:val="5B6B85"/>
+        </w:rPr>
+        <w:t>✓ Recurring revenue &gt;70% (92% ARR) · ✓ Growth &gt;30% (38%) · ✓ Founder-owned · ✓ Net retention &gt;110% (118%) · ⚠ Customer concentration &lt;30% (top-3 = 41%)</w:t>
+      </w:r>
+    </w:p>
+    <w:p>
+      <w:pPr>
+        <w:pStyle w:val="ListBullet"/>
+      </w:pPr>
+      <w:r>
+        <w:rPr>
+          <w:b/>
+        </w:rPr>
+        <w:t xml:space="preserve">Verdict: </w:t>
+      </w:r>
+      <w:r>
+        <w:rPr>
+          <w:color w:val="5B6B85"/>
+        </w:rPr>
+        <w:t>Meets 4 of 5 · Strong fit — diligence the concentration risk before IC.</w:t>
+      </w:r>
     </w:p>
     <w:p>
       <w:pPr>
         <w:pBdr>
           <w:bottom w:val="single" w:sz="6" w:space="1" w:color="D5E2FF"/>
         </w:pBdr>
-        <w:spacing w:before="40" w:after="160"/>
+        <w:spacing w:before="80" w:after="160"/>
       </w:pPr>
     </w:p>
     <w:p>
@@ -1957,10 +1264,11 @@
     <w:p>
       <w:r>
         <w:rPr>
+          <w:b w:val="0"/>
           <w:i w:val="0"/>
           <w:color w:val="5B6B85"/>
         </w:rPr>
-        <w:t>The visual building blocks skills use to present an answer, so output is decision-ready — not a wall of text.</w:t>
+        <w:t>The visual building blocks skills use to present an answer — decision-ready, not a wall of text.</w:t>
       </w:r>
     </w:p>
     <w:p>
@@ -2030,6 +1338,14 @@
         </w:rPr>
         <w:t>— plot a market on two axes to spot the standouts</w:t>
       </w:r>
+      <w:r>
+        <w:rPr>
+          <w:b/>
+          <w:color w:val="1D4ED8"/>
+          <w:sz w:val="16"/>
+        </w:rPr>
+        <w:t xml:space="preserve">   ★ live demo</w:t>
+      </w:r>
     </w:p>
     <w:p>
       <w:pPr>
@@ -2049,12 +1365,113 @@
       </w:r>
     </w:p>
     <w:p>
+      <w:pPr>
+        <w:spacing w:before="180" w:after="20"/>
+      </w:pPr>
       <w:r>
         <w:rPr>
+          <w:b/>
+          <w:color w:val="1D4ED8"/>
+          <w:sz w:val="18"/>
+        </w:rPr>
+        <w:t>LIVE DEMO — HIGHLIGHTED: POSITIONING SCATTER</w:t>
+      </w:r>
+    </w:p>
+    <w:p>
+      <w:r>
+        <w:rPr>
+          <w:b/>
+          <w:i w:val="0"/>
+        </w:rPr>
+        <w:t>User asks:</w:t>
+      </w:r>
+    </w:p>
+    <w:p>
+      <w:pPr>
+        <w:pBdr>
+          <w:left w:val="single" w:sz="18" w:space="8" w:color="1D4ED8"/>
+        </w:pBdr>
+        <w:spacing w:after="100"/>
+        <w:ind w:left="200"/>
+      </w:pPr>
+      <w:r>
+        <w:rPr>
+          <w:i/>
+          <w:sz w:val="24"/>
+        </w:rPr>
+        <w:t>“How does Atlas compare to its peers on growth, margins, and valuation?”</w:t>
+      </w:r>
+    </w:p>
+    <w:p>
+      <w:r>
+        <w:rPr>
+          <w:b/>
+          <w:i w:val="0"/>
+        </w:rPr>
+        <w:t>Claude responds:</w:t>
+      </w:r>
+    </w:p>
+    <w:p>
+      <w:r>
+        <w:rPr>
+          <w:b w:val="0"/>
           <w:i w:val="0"/>
           <w:color w:val="5B6B85"/>
         </w:rPr>
-        <w:t>Components render the answer on screen; templates (next) ship the same answer as a finished file.</w:t>
+        <w:t>Benchmarking Atlas against 8 comparable vertical-SaaS logistics players…</w:t>
+      </w:r>
+    </w:p>
+    <w:p>
+      <w:r>
+        <w:rPr>
+          <w:b w:val="0"/>
+          <w:i w:val="0"/>
+          <w:color w:val="5B6B85"/>
+        </w:rPr>
+        <w:t>Atlas sits top-right: above-median growth at healthy margins — and still priced below the peer multiple.</w:t>
+      </w:r>
+    </w:p>
+    <w:p>
+      <w:r>
+        <w:rPr>
+          <w:b/>
+          <w:i w:val="0"/>
+        </w:rPr>
+        <w:t>Output shown:</w:t>
+      </w:r>
+    </w:p>
+    <w:p>
+      <w:pPr>
+        <w:pStyle w:val="ListBullet"/>
+      </w:pPr>
+      <w:r>
+        <w:rPr>
+          <w:b/>
+        </w:rPr>
+        <w:t xml:space="preserve">Positioning Scatter: </w:t>
+      </w:r>
+      <w:r>
+        <w:rPr>
+          <w:color w:val="5B6B85"/>
+        </w:rPr>
+        <w:t>growth (x) vs EBITDA margin (y), bubble = revenue; 8 peers with Project Atlas highlighted top-right</w:t>
+      </w:r>
+    </w:p>
+    <w:p>
+      <w:pPr>
+        <w:pStyle w:val="ListBullet"/>
+      </w:pPr>
+      <w:r>
+        <w:rPr>
+          <w:b/>
+        </w:rPr>
+        <w:t xml:space="preserve">Summary: </w:t>
+      </w:r>
+      <w:r>
+        <w:rPr>
+          <w:color w:val="5B6B85"/>
+        </w:rPr>
+        <w:t>Atlas leads on growth-adjusted value — 38% growth at 22% EBITDA margin, ~1.5 turns below the peer-median multiple.</w:t>
       </w:r>
     </w:p>
     <w:p>
@@ -2062,7 +1479,7 @@
         <w:pBdr>
           <w:bottom w:val="single" w:sz="6" w:space="1" w:color="D5E2FF"/>
         </w:pBdr>
-        <w:spacing w:before="40" w:after="160"/>
+        <w:spacing w:before="80" w:after="160"/>
       </w:pPr>
     </w:p>
     <w:p>
@@ -2085,371 +1502,222 @@
     <w:p>
       <w:r>
         <w:rPr>
+          <w:b w:val="0"/>
           <w:i w:val="0"/>
           <w:color w:val="5B6B85"/>
         </w:rPr>
-        <w:t>Your house-style Word, Excel &amp; PowerPoint documents. Components render the answer on screen; templates ship it as a finished file.</w:t>
+        <w:t>Your house-style Word, Excel &amp; PowerPoint documents. Components render on screen; templates ship the file.</w:t>
       </w:r>
     </w:p>
-    <w:tbl>
-      <w:tblPr>
-        <w:tblStyle w:val="TableGrid"/>
-        <w:tblW w:type="auto" w:w="0"/>
-        <w:jc w:val="left"/>
-        <w:tblLook w:firstColumn="1" w:firstRow="1" w:lastColumn="0" w:lastRow="0" w:noHBand="0" w:noVBand="1" w:val="04A0"/>
-      </w:tblPr>
-      <w:tblGrid>
-        <w:gridCol w:w="4320"/>
-        <w:gridCol w:w="4320"/>
-      </w:tblGrid>
-      <w:tr>
-        <w:tc>
-          <w:tcPr>
-            <w:tcW w:type="dxa" w:w="6048"/>
-            <w:shd w:val="clear" w:fill="1D4ED8"/>
-          </w:tcPr>
-          <w:p>
-            <w:r/>
-            <w:r>
-              <w:rPr>
-                <w:b/>
-                <w:color w:val="FFFFFF"/>
-                <w:sz w:val="21"/>
-              </w:rPr>
-              <w:t>Deliverable</w:t>
-            </w:r>
-          </w:p>
-        </w:tc>
-        <w:tc>
-          <w:tcPr>
-            <w:tcW w:type="dxa" w:w="4032"/>
-            <w:shd w:val="clear" w:fill="1D4ED8"/>
-          </w:tcPr>
-          <w:p>
-            <w:r/>
-            <w:r>
-              <w:rPr>
-                <w:b/>
-                <w:color w:val="FFFFFF"/>
-                <w:sz w:val="21"/>
-              </w:rPr>
-              <w:t>Format(s)</w:t>
-            </w:r>
-          </w:p>
-        </w:tc>
-      </w:tr>
-      <w:tr>
-        <w:tc>
-          <w:tcPr>
-            <w:tcW w:type="dxa" w:w="6048"/>
-          </w:tcPr>
-          <w:p>
-            <w:r/>
-            <w:r>
-              <w:rPr>
-                <w:sz w:val="21"/>
-              </w:rPr>
-              <w:t>Investment teaser / one-pager</w:t>
-            </w:r>
-          </w:p>
-        </w:tc>
-        <w:tc>
-          <w:tcPr>
-            <w:tcW w:type="dxa" w:w="4032"/>
-          </w:tcPr>
-          <w:p>
-            <w:r/>
-            <w:r>
-              <w:rPr>
-                <w:sz w:val="21"/>
-              </w:rPr>
-              <w:t>PPT / Word</w:t>
-            </w:r>
-          </w:p>
-        </w:tc>
-      </w:tr>
-      <w:tr>
-        <w:tc>
-          <w:tcPr>
-            <w:tcW w:type="dxa" w:w="6048"/>
-          </w:tcPr>
-          <w:p>
-            <w:r/>
-            <w:r>
-              <w:rPr>
-                <w:sz w:val="21"/>
-              </w:rPr>
-              <w:t>IC memo</w:t>
-            </w:r>
-          </w:p>
-        </w:tc>
-        <w:tc>
-          <w:tcPr>
-            <w:tcW w:type="dxa" w:w="4032"/>
-          </w:tcPr>
-          <w:p>
-            <w:r/>
-            <w:r>
-              <w:rPr>
-                <w:sz w:val="21"/>
-              </w:rPr>
-              <w:t>Word</w:t>
-            </w:r>
-          </w:p>
-        </w:tc>
-      </w:tr>
-      <w:tr>
-        <w:tc>
-          <w:tcPr>
-            <w:tcW w:type="dxa" w:w="6048"/>
-          </w:tcPr>
-          <w:p>
-            <w:r/>
-            <w:r>
-              <w:rPr>
-                <w:sz w:val="21"/>
-              </w:rPr>
-              <w:t>IC / deal deck</w:t>
-            </w:r>
-          </w:p>
-        </w:tc>
-        <w:tc>
-          <w:tcPr>
-            <w:tcW w:type="dxa" w:w="4032"/>
-          </w:tcPr>
-          <w:p>
-            <w:r/>
-            <w:r>
-              <w:rPr>
-                <w:sz w:val="21"/>
-              </w:rPr>
-              <w:t>PPT</w:t>
-            </w:r>
-          </w:p>
-        </w:tc>
-      </w:tr>
-      <w:tr>
-        <w:tc>
-          <w:tcPr>
-            <w:tcW w:type="dxa" w:w="6048"/>
-          </w:tcPr>
-          <w:p>
-            <w:r/>
-            <w:r>
-              <w:rPr>
-                <w:sz w:val="21"/>
-              </w:rPr>
-              <w:t>LBO &amp; returns model</w:t>
-            </w:r>
-          </w:p>
-        </w:tc>
-        <w:tc>
-          <w:tcPr>
-            <w:tcW w:type="dxa" w:w="4032"/>
-          </w:tcPr>
-          <w:p>
-            <w:r/>
-            <w:r>
-              <w:rPr>
-                <w:sz w:val="21"/>
-              </w:rPr>
-              <w:t>Excel</w:t>
-            </w:r>
-          </w:p>
-        </w:tc>
-      </w:tr>
-      <w:tr>
-        <w:tc>
-          <w:tcPr>
-            <w:tcW w:type="dxa" w:w="6048"/>
-          </w:tcPr>
-          <w:p>
-            <w:r/>
-            <w:r>
-              <w:rPr>
-                <w:sz w:val="21"/>
-              </w:rPr>
-              <w:t>Comps output</w:t>
-            </w:r>
-          </w:p>
-        </w:tc>
-        <w:tc>
-          <w:tcPr>
-            <w:tcW w:type="dxa" w:w="4032"/>
-          </w:tcPr>
-          <w:p>
-            <w:r/>
-            <w:r>
-              <w:rPr>
-                <w:sz w:val="21"/>
-              </w:rPr>
-              <w:t>Excel</w:t>
-            </w:r>
-          </w:p>
-        </w:tc>
-      </w:tr>
-      <w:tr>
-        <w:tc>
-          <w:tcPr>
-            <w:tcW w:type="dxa" w:w="6048"/>
-          </w:tcPr>
-          <w:p>
-            <w:r/>
-            <w:r>
-              <w:rPr>
-                <w:sz w:val="21"/>
-              </w:rPr>
-              <w:t>QoE summary</w:t>
-            </w:r>
-          </w:p>
-        </w:tc>
-        <w:tc>
-          <w:tcPr>
-            <w:tcW w:type="dxa" w:w="4032"/>
-          </w:tcPr>
-          <w:p>
-            <w:r/>
-            <w:r>
-              <w:rPr>
-                <w:sz w:val="21"/>
-              </w:rPr>
-              <w:t>Excel / Word</w:t>
-            </w:r>
-          </w:p>
-        </w:tc>
-      </w:tr>
-      <w:tr>
-        <w:tc>
-          <w:tcPr>
-            <w:tcW w:type="dxa" w:w="6048"/>
-          </w:tcPr>
-          <w:p>
-            <w:r/>
-            <w:r>
-              <w:rPr>
-                <w:sz w:val="21"/>
-              </w:rPr>
-              <w:t>100-day value-creation plan</w:t>
-            </w:r>
-          </w:p>
-        </w:tc>
-        <w:tc>
-          <w:tcPr>
-            <w:tcW w:type="dxa" w:w="4032"/>
-          </w:tcPr>
-          <w:p>
-            <w:r/>
-            <w:r>
-              <w:rPr>
-                <w:sz w:val="21"/>
-              </w:rPr>
-              <w:t>PPT</w:t>
-            </w:r>
-          </w:p>
-        </w:tc>
-      </w:tr>
-      <w:tr>
-        <w:tc>
-          <w:tcPr>
-            <w:tcW w:type="dxa" w:w="6048"/>
-          </w:tcPr>
-          <w:p>
-            <w:r/>
-            <w:r>
-              <w:rPr>
-                <w:sz w:val="21"/>
-              </w:rPr>
-              <w:t>Quarterly board deck</w:t>
-            </w:r>
-          </w:p>
-        </w:tc>
-        <w:tc>
-          <w:tcPr>
-            <w:tcW w:type="dxa" w:w="4032"/>
-          </w:tcPr>
-          <w:p>
-            <w:r/>
-            <w:r>
-              <w:rPr>
-                <w:sz w:val="21"/>
-              </w:rPr>
-              <w:t>PPT</w:t>
-            </w:r>
-          </w:p>
-        </w:tc>
-      </w:tr>
-      <w:tr>
-        <w:tc>
-          <w:tcPr>
-            <w:tcW w:type="dxa" w:w="6048"/>
-          </w:tcPr>
-          <w:p>
-            <w:r/>
-            <w:r>
-              <w:rPr>
-                <w:sz w:val="21"/>
-              </w:rPr>
-              <w:t>Portfolio monitoring pack</w:t>
-            </w:r>
-          </w:p>
-        </w:tc>
-        <w:tc>
-          <w:tcPr>
-            <w:tcW w:type="dxa" w:w="4032"/>
-          </w:tcPr>
-          <w:p>
-            <w:r/>
-            <w:r>
-              <w:rPr>
-                <w:sz w:val="21"/>
-              </w:rPr>
-              <w:t>Excel + PPT</w:t>
-            </w:r>
-          </w:p>
-        </w:tc>
-      </w:tr>
-      <w:tr>
-        <w:tc>
-          <w:tcPr>
-            <w:tcW w:type="dxa" w:w="6048"/>
-          </w:tcPr>
-          <w:p>
-            <w:r/>
-            <w:r>
-              <w:rPr>
-                <w:sz w:val="21"/>
-              </w:rPr>
-              <w:t>Market map</w:t>
-            </w:r>
-          </w:p>
-        </w:tc>
-        <w:tc>
-          <w:tcPr>
-            <w:tcW w:type="dxa" w:w="4032"/>
-          </w:tcPr>
-          <w:p>
-            <w:r/>
-            <w:r>
-              <w:rPr>
-                <w:sz w:val="21"/>
-              </w:rPr>
-              <w:t>Excel / PPT</w:t>
-            </w:r>
-          </w:p>
-        </w:tc>
-      </w:tr>
-    </w:tbl>
     <w:p>
       <w:pPr>
-        <w:spacing w:after="40"/>
+        <w:pStyle w:val="ListBullet"/>
       </w:pPr>
+      <w:r>
+        <w:rPr>
+          <w:b/>
+        </w:rPr>
+        <w:t>IC memo</w:t>
+      </w:r>
+      <w:r>
+        <w:rPr>
+          <w:color w:val="5B6B85"/>
+        </w:rPr>
+        <w:t>— the full investment committee memo (Word)</w:t>
+      </w:r>
+      <w:r>
+        <w:rPr>
+          <w:b/>
+          <w:color w:val="1D4ED8"/>
+          <w:sz w:val="16"/>
+        </w:rPr>
+        <w:t xml:space="preserve">   ★ live demo</w:t>
+      </w:r>
+    </w:p>
+    <w:p>
+      <w:pPr>
+        <w:pStyle w:val="ListBullet"/>
+      </w:pPr>
+      <w:r>
+        <w:rPr>
+          <w:b/>
+        </w:rPr>
+        <w:t>IC / deal deck</w:t>
+      </w:r>
+      <w:r>
+        <w:rPr>
+          <w:color w:val="5B6B85"/>
+        </w:rPr>
+        <w:t>— the committee presentation (PPT)</w:t>
+      </w:r>
+    </w:p>
+    <w:p>
+      <w:pPr>
+        <w:pStyle w:val="ListBullet"/>
+      </w:pPr>
+      <w:r>
+        <w:rPr>
+          <w:b/>
+        </w:rPr>
+        <w:t>LBO &amp; returns model</w:t>
+      </w:r>
+      <w:r>
+        <w:rPr>
+          <w:color w:val="5B6B85"/>
+        </w:rPr>
+        <w:t>— entry, leverage &amp; exit returns (Excel)</w:t>
+      </w:r>
+    </w:p>
+    <w:p>
+      <w:pPr>
+        <w:pStyle w:val="ListBullet"/>
+      </w:pPr>
+      <w:r>
+        <w:rPr>
+          <w:b/>
+        </w:rPr>
+        <w:t>100-day value-creation plan</w:t>
+      </w:r>
+      <w:r>
+        <w:rPr>
+          <w:color w:val="5B6B85"/>
+        </w:rPr>
+        <w:t>— post-close operating plan (PPT)</w:t>
+      </w:r>
+    </w:p>
+    <w:p>
+      <w:pPr>
+        <w:pStyle w:val="ListBullet"/>
+      </w:pPr>
+      <w:r>
+        <w:rPr>
+          <w:b/>
+        </w:rPr>
+        <w:t>Quarterly board deck</w:t>
+      </w:r>
+      <w:r>
+        <w:rPr>
+          <w:color w:val="5B6B85"/>
+        </w:rPr>
+        <w:t>— the portfolio board pack (PPT)</w:t>
+      </w:r>
+    </w:p>
+    <w:p>
+      <w:pPr>
+        <w:spacing w:before="180" w:after="20"/>
+      </w:pPr>
+      <w:r>
+        <w:rPr>
+          <w:b/>
+          <w:color w:val="1D4ED8"/>
+          <w:sz w:val="18"/>
+        </w:rPr>
+        <w:t>LIVE DEMO — HIGHLIGHTED: IC MEMO</w:t>
+      </w:r>
+    </w:p>
+    <w:p>
+      <w:r>
+        <w:rPr>
+          <w:b/>
+          <w:i w:val="0"/>
+        </w:rPr>
+        <w:t>User asks:</w:t>
+      </w:r>
+    </w:p>
+    <w:p>
+      <w:pPr>
+        <w:pBdr>
+          <w:left w:val="single" w:sz="18" w:space="8" w:color="1D4ED8"/>
+        </w:pBdr>
+        <w:spacing w:after="100"/>
+        <w:ind w:left="200"/>
+      </w:pPr>
+      <w:r>
+        <w:rPr>
+          <w:i/>
+          <w:sz w:val="24"/>
+        </w:rPr>
+        <w:t>“Turn everything we have on Atlas into our house-style IC memo.”</w:t>
+      </w:r>
+    </w:p>
+    <w:p>
+      <w:r>
+        <w:rPr>
+          <w:b/>
+          <w:i w:val="0"/>
+        </w:rPr>
+        <w:t>Claude responds:</w:t>
+      </w:r>
+    </w:p>
+    <w:p>
+      <w:r>
+        <w:rPr>
+          <w:b w:val="0"/>
+          <w:i w:val="0"/>
+          <w:color w:val="5B6B85"/>
+        </w:rPr>
+        <w:t>Assembling the memo from the thesis fit, comps, diligence findings and returns model…</w:t>
+      </w:r>
+    </w:p>
+    <w:p>
+      <w:r>
+        <w:rPr>
+          <w:b w:val="0"/>
+          <w:i w:val="0"/>
+          <w:color w:val="5B6B85"/>
+        </w:rPr>
+        <w:t>Drafted a full IC memo in your template — comps table and risk heatmap embedded, 2 open items flagged for the deal team.</w:t>
+      </w:r>
+    </w:p>
+    <w:p>
+      <w:r>
+        <w:rPr>
+          <w:b/>
+          <w:i w:val="0"/>
+        </w:rPr>
+        <w:t>Output shown:</w:t>
+      </w:r>
+    </w:p>
+    <w:p>
+      <w:pPr>
+        <w:pStyle w:val="ListBullet"/>
+      </w:pPr>
+      <w:r>
+        <w:rPr>
+          <w:b/>
+        </w:rPr>
+        <w:t xml:space="preserve">Project Atlas — IC Memo.docx (Word · house template). Sections: </w:t>
+      </w:r>
+      <w:r>
+        <w:rPr>
+          <w:color w:val="5B6B85"/>
+        </w:rPr>
+        <w:t>1) Executive summary &amp; recommendation  2) Investment thesis &amp; fit  3) Market &amp; competitive position  4) Financials &amp; comparable companies  5) Diligence findings &amp; key risks  6) Valuation &amp; returns  7) Proposed deal structure</w:t>
+      </w:r>
+    </w:p>
+    <w:p>
+      <w:pPr>
+        <w:pStyle w:val="ListBullet"/>
+      </w:pPr>
+      <w:r>
+        <w:rPr>
+          <w:b/>
+        </w:rPr>
+        <w:t xml:space="preserve">Recommendation: </w:t>
+      </w:r>
+      <w:r>
+        <w:rPr>
+          <w:color w:val="5B6B85"/>
+        </w:rPr>
+        <w:t>proceed to confirmatory DD · entry €120M (11.5× EBITDA) · base case 2.8× / 24% IRR</w:t>
+      </w:r>
     </w:p>
     <w:p>
       <w:pPr>
         <w:pBdr>
           <w:bottom w:val="single" w:sz="6" w:space="1" w:color="D5E2FF"/>
         </w:pBdr>
-        <w:spacing w:before="40" w:after="160"/>
+        <w:spacing w:before="80" w:after="160"/>
       </w:pPr>
     </w:p>
     <w:p>
@@ -2473,8 +1741,8 @@
       <w:r>
         <w:rPr>
           <w:b/>
+          <w:i w:val="0"/>
           <w:color w:val="1D4ED8"/>
-          <w:sz w:val="44"/>
         </w:rPr>
         <w:t>Days → Minutes</w:t>
       </w:r>
@@ -2482,6 +1750,7 @@
     <w:p>
       <w:r>
         <w:rPr>
+          <w:b w:val="0"/>
           <w:i w:val="0"/>
           <w:color w:val="5B6B85"/>
         </w:rPr>
@@ -2491,6 +1760,7 @@
     <w:p>
       <w:r>
         <w:rPr>
+          <w:b w:val="0"/>
           <w:i w:val="0"/>
         </w:rPr>
         <w:t>Every answer is: thesis-aware · sourced · firm-grade · IC-ready.</w:t>
@@ -2501,7 +1771,7 @@
         <w:pBdr>
           <w:bottom w:val="single" w:sz="6" w:space="1" w:color="D5E2FF"/>
         </w:pBdr>
-        <w:spacing w:before="40" w:after="160"/>
+        <w:spacing w:before="80" w:after="160"/>
       </w:pPr>
     </w:p>
     <w:p>
@@ -2691,7 +1961,7 @@
         <w:pBdr>
           <w:bottom w:val="single" w:sz="6" w:space="1" w:color="D5E2FF"/>
         </w:pBdr>
-        <w:spacing w:before="40" w:after="160"/>
+        <w:spacing w:before="80" w:after="160"/>
       </w:pPr>
     </w:p>
     <w:p>
@@ -2715,8 +1985,8 @@
       <w:r>
         <w:rPr>
           <w:b/>
+          <w:i w:val="0"/>
           <w:color w:val="1D4ED8"/>
-          <w:sz w:val="26"/>
         </w:rPr>
         <w:t>Reach out to book a demo.</w:t>
       </w:r>
@@ -2724,6 +1994,7 @@
     <w:p>
       <w:r>
         <w:rPr>
+          <w:b w:val="0"/>
           <w:i w:val="0"/>
           <w:color w:val="5B6B85"/>
         </w:rPr>
@@ -3104,7 +2375,7 @@
     <w:qFormat/>
     <w:rsid w:val="00FC693F"/>
     <w:pPr>
-      <w:spacing w:after="120" w:line="276" w:lineRule="auto"/>
+      <w:spacing w:after="100" w:line="274" w:lineRule="auto"/>
     </w:pPr>
     <w:rPr>
       <w:rFonts w:ascii="Calibri" w:hAnsi="Calibri"/>
@@ -3167,7 +2438,7 @@
     <w:pPr>
       <w:keepNext/>
       <w:keepLines/>
-      <w:spacing w:before="440" w:after="120"/>
+      <w:spacing w:before="400" w:after="80"/>
       <w:outlineLvl w:val="0"/>
     </w:pPr>
     <w:rPr>
@@ -3175,7 +2446,7 @@
       <w:b/>
       <w:bCs/>
       <w:color w:val="1D4ED8"/>
-      <w:sz w:val="38"/>
+      <w:sz w:val="36"/>
       <w:szCs w:val="28"/>
     </w:rPr>
   </w:style>
@@ -3191,7 +2462,7 @@
     <w:pPr>
       <w:keepNext/>
       <w:keepLines/>
-      <w:spacing w:before="240" w:after="80"/>
+      <w:spacing w:before="220" w:after="60"/>
       <w:outlineLvl w:val="1"/>
     </w:pPr>
     <w:rPr>
@@ -3199,7 +2470,7 @@
       <w:b/>
       <w:bCs/>
       <w:color w:val="0F1B33"/>
-      <w:sz w:val="28"/>
+      <w:sz w:val="25"/>
       <w:szCs w:val="26"/>
     </w:rPr>
   </w:style>
@@ -3465,7 +2736,7 @@
       <w:color w:val="0F1B33"/>
       <w:spacing w:val="5"/>
       <w:kern w:val="28"/>
-      <w:sz w:val="60"/>
+      <w:sz w:val="56"/>
       <w:szCs w:val="52"/>
     </w:rPr>
   </w:style>
@@ -3496,7 +2767,7 @@
       <w:numPr>
         <w:ilvl w:val="1"/>
       </w:numPr>
-      <w:spacing w:before="0" w:after="280"/>
+      <w:spacing w:before="0" w:after="240"/>
     </w:pPr>
     <w:rPr>
       <w:rFonts w:asciiTheme="majorHAnsi" w:eastAsiaTheme="majorEastAsia" w:hAnsiTheme="majorHAnsi" w:cstheme="majorBidi" w:ascii="Calibri" w:hAnsi="Calibri"/>
@@ -3505,7 +2776,7 @@
       <w:iCs/>
       <w:color w:val="1D4ED8"/>
       <w:spacing w:val="15"/>
-      <w:sz w:val="28"/>
+      <w:sz w:val="26"/>
       <w:szCs w:val="24"/>
     </w:rPr>
   </w:style>

</xml_diff>